<commit_message>
Documentacao detalhada (docs/DOCUMENTACAO.md) e remove assinatura dos entregaveis
Co-Authored-By: Claude Opus 4.8 <noreply@anthropic.com>
</commit_message>
<xml_diff>
--- a/entregaveis/Documentacao.docx
+++ b/entregaveis/Documentacao.docx
@@ -2,48 +2,84 @@
 <file path=word/document.xml><?xml version="1.0" encoding="utf-8"?>
 <w:document xmlns:w="http://schemas.openxmlformats.org/wordprocessingml/2006/main" xmlns:m="http://schemas.openxmlformats.org/officeDocument/2006/math" xmlns:r="http://schemas.openxmlformats.org/officeDocument/2006/relationships" xmlns:o="urn:schemas-microsoft-com:office:office" xmlns:v="urn:schemas-microsoft-com:vml" xmlns:w10="urn:schemas-microsoft-com:office:word" xmlns:a="http://schemas.openxmlformats.org/drawingml/2006/main" xmlns:pic="http://schemas.openxmlformats.org/drawingml/2006/picture" xmlns:wp="http://schemas.openxmlformats.org/drawingml/2006/wordprocessingDrawing">
   <w:body>
-    <w:bookmarkStart w:id="15" w:name="orçamento-preliminar-ifc"/>
+    <w:bookmarkStart w:id="23" w:name="X666ca8d24a4861566f438bb5c0367a600567e18"/>
     <w:p>
       <w:pPr>
         <w:pStyle w:val="Heading1"/>
       </w:pPr>
       <w:r>
+        <w:t xml:space="preserve">Documentação do Projeto — Orçamento Preliminar IFC</w:t>
+      </w:r>
+    </w:p>
+    <w:bookmarkStart w:id="9" w:name="visão-geral"/>
+    <w:p>
+      <w:pPr>
+        <w:pStyle w:val="Heading2"/>
+      </w:pPr>
+      <w:r>
+        <w:t xml:space="preserve">1. Visão geral</w:t>
+      </w:r>
+    </w:p>
+    <w:p>
+      <w:pPr>
+        <w:pStyle w:val="FirstParagraph"/>
+      </w:pPr>
+      <w:r>
+        <w:t xml:space="preserve">O</w:t>
+      </w:r>
+      <w:r>
+        <w:t xml:space="preserve"> </w:t>
+      </w:r>
+      <w:r>
+        <w:rPr>
+          <w:b/>
+          <w:bCs/>
+        </w:rPr>
         <w:t xml:space="preserve">Orçamento Preliminar IFC</w:t>
       </w:r>
-    </w:p>
-    <w:p>
-      <w:pPr>
-        <w:pStyle w:val="FirstParagraph"/>
-      </w:pPr>
-      <w:r>
-        <w:t xml:space="preserve">Aplicativo web que gera um</w:t>
-      </w:r>
-      <w:r>
-        <w:t xml:space="preserve"> </w:t>
-      </w:r>
-      <w:r>
-        <w:rPr>
-          <w:b/>
-          <w:bCs/>
-        </w:rPr>
-        <w:t xml:space="preserve">orçamento preliminar de obra a partir de um arquivo</w:t>
-      </w:r>
-      <w:r>
-        <w:rPr>
-          <w:b/>
-          <w:bCs/>
-        </w:rPr>
-        <w:t xml:space="preserve"> </w:t>
-      </w:r>
-      <w:r>
-        <w:rPr>
-          <w:b/>
-          <w:bCs/>
-        </w:rPr>
-        <w:t xml:space="preserve">IFC (BIM)</w:t>
-      </w:r>
-      <w:r>
-        <w:t xml:space="preserve">. Importe um</w:t>
+      <w:r>
+        <w:t xml:space="preserve"> </w:t>
+      </w:r>
+      <w:r>
+        <w:t xml:space="preserve">é um aplicativo web que automatiza a geração de um</w:t>
+      </w:r>
+      <w:r>
+        <w:t xml:space="preserve"> </w:t>
+      </w:r>
+      <w:r>
+        <w:t xml:space="preserve">orçamento preliminar de obra a partir de um modelo</w:t>
+      </w:r>
+      <w:r>
+        <w:t xml:space="preserve"> </w:t>
+      </w:r>
+      <w:r>
+        <w:rPr>
+          <w:b/>
+          <w:bCs/>
+        </w:rPr>
+        <w:t xml:space="preserve">BIM</w:t>
+      </w:r>
+      <w:r>
+        <w:t xml:space="preserve"> </w:t>
+      </w:r>
+      <w:r>
+        <w:t xml:space="preserve">no formato</w:t>
+      </w:r>
+      <w:r>
+        <w:t xml:space="preserve"> </w:t>
+      </w:r>
+      <w:r>
+        <w:rPr>
+          <w:b/>
+          <w:bCs/>
+        </w:rPr>
+        <w:t xml:space="preserve">IFC</w:t>
+      </w:r>
+      <w:r>
+        <w:t xml:space="preserve"> </w:t>
+      </w:r>
+      <w:r>
+        <w:t xml:space="preserve">(Industry Foundation Classes). O usuário importa um arquivo</w:t>
       </w:r>
       <w:r>
         <w:t xml:space="preserve"> </w:t>
@@ -55,113 +91,77 @@
         <w:t xml:space="preserve">.ifc</w:t>
       </w:r>
       <w:r>
-        <w:t xml:space="preserve">, visualize o modelo em 3D, e o app lê os elementos</w:t>
-      </w:r>
-      <w:r>
-        <w:t xml:space="preserve"> </w:t>
-      </w:r>
-      <w:r>
-        <w:t xml:space="preserve">construtivos e suas quantidades (áreas, comprimentos, volumes),</w:t>
-      </w:r>
-      <w:r>
-        <w:t xml:space="preserve"> </w:t>
-      </w:r>
-      <w:r>
-        <w:rPr>
-          <w:b/>
-          <w:bCs/>
-        </w:rPr>
-        <w:t xml:space="preserve">traduz para</w:t>
-      </w:r>
-      <w:r>
-        <w:rPr>
-          <w:b/>
-          <w:bCs/>
-        </w:rPr>
-        <w:t xml:space="preserve"> </w:t>
-      </w:r>
-      <w:r>
-        <w:rPr>
-          <w:b/>
-          <w:bCs/>
-        </w:rPr>
-        <w:t xml:space="preserve">itens de orçamento</w:t>
-      </w:r>
-      <w:r>
-        <w:t xml:space="preserve"> </w:t>
-      </w:r>
-      <w:r>
-        <w:t xml:space="preserve">(serviço, unidade, quantidade) e</w:t>
-      </w:r>
-      <w:r>
-        <w:t xml:space="preserve"> </w:t>
-      </w:r>
-      <w:r>
-        <w:rPr>
-          <w:b/>
-          <w:bCs/>
-        </w:rPr>
-        <w:t xml:space="preserve">precifica</w:t>
-      </w:r>
-      <w:r>
-        <w:t xml:space="preserve"> </w:t>
-      </w:r>
-      <w:r>
-        <w:t xml:space="preserve">usando uma</w:t>
-      </w:r>
-      <w:r>
-        <w:t xml:space="preserve"> </w:t>
-      </w:r>
-      <w:r>
-        <w:t xml:space="preserve">referência de custos</w:t>
-      </w:r>
-      <w:r>
-        <w:t xml:space="preserve"> </w:t>
-      </w:r>
-      <w:r>
-        <w:rPr>
-          <w:b/>
-          <w:bCs/>
-        </w:rPr>
-        <w:t xml:space="preserve">SINAPI</w:t>
-      </w:r>
-      <w:r>
-        <w:t xml:space="preserve">. Exporte a planilha</w:t>
-      </w:r>
-      <w:r>
-        <w:t xml:space="preserve"> </w:t>
+        <w:t xml:space="preserve">, visualiza o</w:t>
+      </w:r>
+      <w:r>
+        <w:t xml:space="preserve"> </w:t>
+      </w:r>
+      <w:r>
+        <w:t xml:space="preserve">modelo em 3D e obtém uma planilha orçamentária com serviços, quantidades,</w:t>
+      </w:r>
+      <w:r>
+        <w:t xml:space="preserve"> </w:t>
+      </w:r>
+      <w:r>
+        <w:t xml:space="preserve">unidades e preços — exportável em Excel.</w:t>
+      </w:r>
+    </w:p>
+    <w:p>
+      <w:pPr>
+        <w:pStyle w:val="BodyText"/>
+      </w:pPr>
+      <w:r>
+        <w:t xml:space="preserve">A premissa central é que o IFC, por ser um dado</w:t>
+      </w:r>
+      <w:r>
+        <w:t xml:space="preserve"> </w:t>
+      </w:r>
+      <w:r>
+        <w:rPr>
+          <w:b/>
+          <w:bCs/>
+        </w:rPr>
+        <w:t xml:space="preserve">estruturado</w:t>
+      </w:r>
+      <w:r>
+        <w:t xml:space="preserve">, já carrega as</w:t>
+      </w:r>
+      <w:r>
+        <w:t xml:space="preserve"> </w:t>
+      </w:r>
+      <w:r>
+        <w:t xml:space="preserve">quantidades calculadas dos elementos construtivos (</w:t>
       </w:r>
       <w:r>
         <w:rPr>
           <w:rStyle w:val="VerbatimChar"/>
         </w:rPr>
-        <w:t xml:space="preserve">.xlsx</w:t>
-      </w:r>
-      <w:r>
-        <w:t xml:space="preserve">.</w:t>
-      </w:r>
-    </w:p>
-    <w:p>
-      <w:pPr>
-        <w:pStyle w:val="BlockText"/>
-      </w:pPr>
-      <w:r>
-        <w:t xml:space="preserve">O IFC é estruturado e já traz as quantidades calculadas, gerando um takeoff</w:t>
-      </w:r>
-      <w:r>
-        <w:t xml:space="preserve"> </w:t>
-      </w:r>
-      <w:r>
-        <w:t xml:space="preserve">muito mais confiável do que extrair de uma planta em PDF.</w:t>
-      </w:r>
-    </w:p>
-    <w:bookmarkStart w:id="9" w:name="recursos"/>
+        <w:t xml:space="preserve">BaseQuantities</w:t>
+      </w:r>
+      <w:r>
+        <w:t xml:space="preserve">). Isso elimina</w:t>
+      </w:r>
+      <w:r>
+        <w:t xml:space="preserve"> </w:t>
+      </w:r>
+      <w:r>
+        <w:t xml:space="preserve">a calibração manual e os erros de medição típicos da extração a partir de plantas</w:t>
+      </w:r>
+      <w:r>
+        <w:t xml:space="preserve"> </w:t>
+      </w:r>
+      <w:r>
+        <w:t xml:space="preserve">em PDF.</w:t>
+      </w:r>
+    </w:p>
+    <w:bookmarkEnd w:id="9"/>
+    <w:bookmarkStart w:id="10" w:name="objetivos"/>
     <w:p>
       <w:pPr>
         <w:pStyle w:val="Heading2"/>
       </w:pPr>
       <w:r>
-        <w:t xml:space="preserve">Recursos</w:t>
+        <w:t xml:space="preserve">2. Objetivos</w:t>
       </w:r>
     </w:p>
     <w:p>
@@ -173,35 +173,7 @@
         </w:numPr>
       </w:pPr>
       <w:r>
-        <w:t xml:space="preserve">Upload de</w:t>
-      </w:r>
-      <w:r>
-        <w:t xml:space="preserve"> </w:t>
-      </w:r>
-      <w:r>
-        <w:rPr>
-          <w:rStyle w:val="VerbatimChar"/>
-        </w:rPr>
-        <w:t xml:space="preserve">.ifc</w:t>
-      </w:r>
-      <w:r>
-        <w:t xml:space="preserve"> </w:t>
-      </w:r>
-      <w:r>
-        <w:t xml:space="preserve">(testado com IFC2X3 exportado do Revit) e</w:t>
-      </w:r>
-      <w:r>
-        <w:t xml:space="preserve"> </w:t>
-      </w:r>
-      <w:r>
-        <w:rPr>
-          <w:b/>
-          <w:bCs/>
-        </w:rPr>
-        <w:t xml:space="preserve">visualizador 3D</w:t>
-      </w:r>
-      <w:r>
-        <w:t xml:space="preserve">.</w:t>
+        <w:t xml:space="preserve">Reduzir o tempo de levantamento de quantitativos (takeoff) de obras.</w:t>
       </w:r>
     </w:p>
     <w:p>
@@ -213,19 +185,23 @@
         </w:numPr>
       </w:pPr>
       <w:r>
-        <w:t xml:space="preserve">Parser leve de STEP/ISO-10303-21 (sem WASM): lê elementos e</w:t>
-      </w:r>
-      <w:r>
-        <w:t xml:space="preserve"> </w:t>
-      </w:r>
-      <w:r>
-        <w:rPr>
-          <w:rStyle w:val="VerbatimChar"/>
-        </w:rPr>
-        <w:t xml:space="preserve">BaseQuantities</w:t>
-      </w:r>
-      <w:r>
-        <w:t xml:space="preserve">.</w:t>
+        <w:t xml:space="preserve">Traduzir elementos BIM em</w:t>
+      </w:r>
+      <w:r>
+        <w:t xml:space="preserve"> </w:t>
+      </w:r>
+      <w:r>
+        <w:rPr>
+          <w:b/>
+          <w:bCs/>
+        </w:rPr>
+        <w:t xml:space="preserve">linguagem de orçamento</w:t>
+      </w:r>
+      <w:r>
+        <w:t xml:space="preserve"> </w:t>
+      </w:r>
+      <w:r>
+        <w:t xml:space="preserve">(serviço/unidade/quantidade).</w:t>
       </w:r>
     </w:p>
     <w:p>
@@ -237,13 +213,26 @@
         </w:numPr>
       </w:pPr>
       <w:r>
-        <w:t xml:space="preserve">Normalização de unidades (mm→m, mm²→m², mm³→m³) e dedup de quantidades</w:t>
-      </w:r>
-      <w:r>
-        <w:t xml:space="preserve"> </w:t>
-      </w:r>
-      <w:r>
-        <w:t xml:space="preserve">duplicadas pelo exportador.</w:t>
+        <w:t xml:space="preserve">Precificar automaticamente com base em referência</w:t>
+      </w:r>
+      <w:r>
+        <w:t xml:space="preserve"> </w:t>
+      </w:r>
+      <w:r>
+        <w:rPr>
+          <w:b/>
+          <w:bCs/>
+        </w:rPr>
+        <w:t xml:space="preserve">SINAPI</w:t>
+      </w:r>
+      <w:r>
+        <w:t xml:space="preserve">, permitindo</w:t>
+      </w:r>
+      <w:r>
+        <w:t xml:space="preserve"> </w:t>
+      </w:r>
+      <w:r>
+        <w:t xml:space="preserve">ajustes manuais pelo orçamentista.</w:t>
       </w:r>
     </w:p>
     <w:p>
@@ -255,19 +244,417 @@
         </w:numPr>
       </w:pPr>
       <w:r>
-        <w:t xml:space="preserve">Tradução para itens de orçamento agrupados por etapa: serviços preliminares,</w:t>
-      </w:r>
-      <w:r>
-        <w:t xml:space="preserve"> </w:t>
-      </w:r>
-      <w:r>
-        <w:t xml:space="preserve">fundações, superestrutura, alvenaria, cobertura, esquadrias, revestimentos,</w:t>
-      </w:r>
-      <w:r>
-        <w:t xml:space="preserve"> </w:t>
-      </w:r>
-      <w:r>
-        <w:t xml:space="preserve">pisos e pintura.</w:t>
+        <w:t xml:space="preserve">Entregar uma planilha pronta para uso em</w:t>
+      </w:r>
+      <w:r>
+        <w:t xml:space="preserve"> </w:t>
+      </w:r>
+      <w:r>
+        <w:rPr>
+          <w:rStyle w:val="VerbatimChar"/>
+        </w:rPr>
+        <w:t xml:space="preserve">.xlsx</w:t>
+      </w:r>
+      <w:r>
+        <w:t xml:space="preserve">.</w:t>
+      </w:r>
+    </w:p>
+    <w:bookmarkEnd w:id="10"/>
+    <w:bookmarkStart w:id="12" w:name="arquitetura-e-stack"/>
+    <w:p>
+      <w:pPr>
+        <w:pStyle w:val="Heading2"/>
+      </w:pPr>
+      <w:r>
+        <w:t xml:space="preserve">3. Arquitetura e stack</w:t>
+      </w:r>
+    </w:p>
+    <w:tbl>
+      <w:tblPr>
+        <w:tblStyle w:val="Table"/>
+        <w:tblW w:type="pct" w:w="5000"/>
+        <w:tblLayout w:type="fixed"/>
+        <w:tblLook w:firstRow="1" w:lastRow="0" w:firstColumn="0" w:lastColumn="0" w:noHBand="0" w:noVBand="0" w:val="0020"/>
+      </w:tblPr>
+      <w:tblGrid>
+        <w:gridCol w:w="2640"/>
+        <w:gridCol w:w="2640"/>
+        <w:gridCol w:w="2640"/>
+      </w:tblGrid>
+      <w:tr>
+        <w:trPr>
+          <w:tblHeader w:val="on"/>
+        </w:trPr>
+        <w:tc>
+          <w:tcPr/>
+          <w:p>
+            <w:pPr>
+              <w:pStyle w:val="Compact"/>
+            </w:pPr>
+            <w:r>
+              <w:t xml:space="preserve">Camada</w:t>
+            </w:r>
+          </w:p>
+        </w:tc>
+        <w:tc>
+          <w:tcPr/>
+          <w:p>
+            <w:pPr>
+              <w:pStyle w:val="Compact"/>
+            </w:pPr>
+            <w:r>
+              <w:t xml:space="preserve">Tecnologia</w:t>
+            </w:r>
+          </w:p>
+        </w:tc>
+        <w:tc>
+          <w:tcPr/>
+          <w:p>
+            <w:pPr>
+              <w:pStyle w:val="Compact"/>
+            </w:pPr>
+            <w:r>
+              <w:t xml:space="preserve">Responsabilidade</w:t>
+            </w:r>
+          </w:p>
+        </w:tc>
+      </w:tr>
+      <w:tr>
+        <w:tc>
+          <w:tcPr/>
+          <w:p>
+            <w:pPr>
+              <w:pStyle w:val="Compact"/>
+            </w:pPr>
+            <w:r>
+              <w:t xml:space="preserve">Front-end / UI</w:t>
+            </w:r>
+          </w:p>
+        </w:tc>
+        <w:tc>
+          <w:tcPr/>
+          <w:p>
+            <w:pPr>
+              <w:pStyle w:val="Compact"/>
+            </w:pPr>
+            <w:r>
+              <w:t xml:space="preserve">Next.js (App Router) + React + Tailwind</w:t>
+            </w:r>
+          </w:p>
+        </w:tc>
+        <w:tc>
+          <w:tcPr/>
+          <w:p>
+            <w:pPr>
+              <w:pStyle w:val="Compact"/>
+            </w:pPr>
+            <w:r>
+              <w:t xml:space="preserve">Upload, viewer 3D, tabela editável, exportação</w:t>
+            </w:r>
+          </w:p>
+        </w:tc>
+      </w:tr>
+      <w:tr>
+        <w:tc>
+          <w:tcPr/>
+          <w:p>
+            <w:pPr>
+              <w:pStyle w:val="Compact"/>
+            </w:pPr>
+            <w:r>
+              <w:t xml:space="preserve">Visualização 3D</w:t>
+            </w:r>
+          </w:p>
+        </w:tc>
+        <w:tc>
+          <w:tcPr/>
+          <w:p>
+            <w:pPr>
+              <w:pStyle w:val="Compact"/>
+            </w:pPr>
+            <w:r>
+              <w:t xml:space="preserve">web-ifc</w:t>
+            </w:r>
+          </w:p>
+        </w:tc>
+        <w:tc>
+          <w:tcPr/>
+          <w:p>
+            <w:pPr>
+              <w:pStyle w:val="Compact"/>
+            </w:pPr>
+            <w:r>
+              <w:t xml:space="preserve">Renderiza o modelo e destaca objetos</w:t>
+            </w:r>
+          </w:p>
+        </w:tc>
+      </w:tr>
+      <w:tr>
+        <w:tc>
+          <w:tcPr/>
+          <w:p>
+            <w:pPr>
+              <w:pStyle w:val="Compact"/>
+            </w:pPr>
+            <w:r>
+              <w:t xml:space="preserve">Parsing</w:t>
+            </w:r>
+          </w:p>
+        </w:tc>
+        <w:tc>
+          <w:tcPr/>
+          <w:p>
+            <w:pPr>
+              <w:pStyle w:val="Compact"/>
+            </w:pPr>
+            <w:r>
+              <w:t xml:space="preserve">Parser STEP próprio (</w:t>
+            </w:r>
+            <w:r>
+              <w:rPr>
+                <w:rStyle w:val="VerbatimChar"/>
+              </w:rPr>
+              <w:t xml:space="preserve">lib/ifc.ts</w:t>
+            </w:r>
+            <w:r>
+              <w:t xml:space="preserve">)</w:t>
+            </w:r>
+          </w:p>
+        </w:tc>
+        <w:tc>
+          <w:tcPr/>
+          <w:p>
+            <w:pPr>
+              <w:pStyle w:val="Compact"/>
+            </w:pPr>
+            <w:r>
+              <w:t xml:space="preserve">Lê elementos IFC e quantidades</w:t>
+            </w:r>
+          </w:p>
+        </w:tc>
+      </w:tr>
+      <w:tr>
+        <w:tc>
+          <w:tcPr/>
+          <w:p>
+            <w:pPr>
+              <w:pStyle w:val="Compact"/>
+            </w:pPr>
+            <w:r>
+              <w:t xml:space="preserve">Regra de negócio</w:t>
+            </w:r>
+          </w:p>
+        </w:tc>
+        <w:tc>
+          <w:tcPr/>
+          <w:p>
+            <w:pPr>
+              <w:pStyle w:val="Compact"/>
+            </w:pPr>
+            <w:r>
+              <w:rPr>
+                <w:rStyle w:val="VerbatimChar"/>
+              </w:rPr>
+              <w:t xml:space="preserve">lib/budget.ts</w:t>
+            </w:r>
+          </w:p>
+        </w:tc>
+        <w:tc>
+          <w:tcPr/>
+          <w:p>
+            <w:pPr>
+              <w:pStyle w:val="Compact"/>
+            </w:pPr>
+            <w:r>
+              <w:t xml:space="preserve">Traduz elementos em itens de orçamento</w:t>
+            </w:r>
+          </w:p>
+        </w:tc>
+      </w:tr>
+      <w:tr>
+        <w:tc>
+          <w:tcPr/>
+          <w:p>
+            <w:pPr>
+              <w:pStyle w:val="Compact"/>
+            </w:pPr>
+            <w:r>
+              <w:t xml:space="preserve">Precificação</w:t>
+            </w:r>
+          </w:p>
+        </w:tc>
+        <w:tc>
+          <w:tcPr/>
+          <w:p>
+            <w:pPr>
+              <w:pStyle w:val="Compact"/>
+            </w:pPr>
+            <w:r>
+              <w:rPr>
+                <w:rStyle w:val="VerbatimChar"/>
+              </w:rPr>
+              <w:t xml:space="preserve">lib/sinapi.ts</w:t>
+            </w:r>
+          </w:p>
+        </w:tc>
+        <w:tc>
+          <w:tcPr/>
+          <w:p>
+            <w:pPr>
+              <w:pStyle w:val="Compact"/>
+            </w:pPr>
+            <w:r>
+              <w:t xml:space="preserve">Tabela de referência de custos</w:t>
+            </w:r>
+          </w:p>
+        </w:tc>
+      </w:tr>
+      <w:tr>
+        <w:tc>
+          <w:tcPr/>
+          <w:p>
+            <w:pPr>
+              <w:pStyle w:val="Compact"/>
+            </w:pPr>
+            <w:r>
+              <w:t xml:space="preserve">Exportação</w:t>
+            </w:r>
+          </w:p>
+        </w:tc>
+        <w:tc>
+          <w:tcPr/>
+          <w:p>
+            <w:pPr>
+              <w:pStyle w:val="Compact"/>
+            </w:pPr>
+            <w:r>
+              <w:t xml:space="preserve">exceljs (</w:t>
+            </w:r>
+            <w:r>
+              <w:rPr>
+                <w:rStyle w:val="VerbatimChar"/>
+              </w:rPr>
+              <w:t xml:space="preserve">lib/ifcXlsx.ts</w:t>
+            </w:r>
+            <w:r>
+              <w:t xml:space="preserve">)</w:t>
+            </w:r>
+          </w:p>
+        </w:tc>
+        <w:tc>
+          <w:tcPr/>
+          <w:p>
+            <w:pPr>
+              <w:pStyle w:val="Compact"/>
+            </w:pPr>
+            <w:r>
+              <w:t xml:space="preserve">Gera a planilha</w:t>
+            </w:r>
+            <w:r>
+              <w:t xml:space="preserve"> </w:t>
+            </w:r>
+            <w:r>
+              <w:rPr>
+                <w:rStyle w:val="VerbatimChar"/>
+              </w:rPr>
+              <w:t xml:space="preserve">.xlsx</w:t>
+            </w:r>
+          </w:p>
+        </w:tc>
+      </w:tr>
+    </w:tbl>
+    <w:bookmarkStart w:id="11" w:name="estrutura-de-pastas"/>
+    <w:p>
+      <w:pPr>
+        <w:pStyle w:val="Heading3"/>
+      </w:pPr>
+      <w:r>
+        <w:t xml:space="preserve">3.1 Estrutura de pastas</w:t>
+      </w:r>
+    </w:p>
+    <w:p>
+      <w:pPr>
+        <w:pStyle w:val="SourceCode"/>
+      </w:pPr>
+      <w:r>
+        <w:rPr>
+          <w:rStyle w:val="VerbatimChar"/>
+        </w:rPr>
+        <w:t xml:space="preserve">app/page.tsx                 # UI: upload IFC, viewer 3D, tabela e download</w:t>
+      </w:r>
+      <w:r>
+        <w:br/>
+      </w:r>
+      <w:r>
+        <w:rPr>
+          <w:rStyle w:val="VerbatimChar"/>
+        </w:rPr>
+        <w:t xml:space="preserve">app/layout.tsx               # metadados e fontes</w:t>
+      </w:r>
+      <w:r>
+        <w:br/>
+      </w:r>
+      <w:r>
+        <w:rPr>
+          <w:rStyle w:val="VerbatimChar"/>
+        </w:rPr>
+        <w:t xml:space="preserve">app/api/ifc/route.ts         # endpoint: parse do IFC -&gt; orçamento (JSON)</w:t>
+      </w:r>
+      <w:r>
+        <w:br/>
+      </w:r>
+      <w:r>
+        <w:rPr>
+          <w:rStyle w:val="VerbatimChar"/>
+        </w:rPr>
+        <w:t xml:space="preserve">app/api/ifc/export/route.ts  # endpoint: gera a planilha .xlsx</w:t>
+      </w:r>
+      <w:r>
+        <w:br/>
+      </w:r>
+      <w:r>
+        <w:rPr>
+          <w:rStyle w:val="VerbatimChar"/>
+        </w:rPr>
+        <w:t xml:space="preserve">lib/ifc.ts                   # parser STEP + extração de quantidades + unidades</w:t>
+      </w:r>
+      <w:r>
+        <w:br/>
+      </w:r>
+      <w:r>
+        <w:rPr>
+          <w:rStyle w:val="VerbatimChar"/>
+        </w:rPr>
+        <w:t xml:space="preserve">lib/budget.ts                # tradução para itens de orçamento (PT-BR)</w:t>
+      </w:r>
+      <w:r>
+        <w:br/>
+      </w:r>
+      <w:r>
+        <w:rPr>
+          <w:rStyle w:val="VerbatimChar"/>
+        </w:rPr>
+        <w:t xml:space="preserve">lib/sinapi.ts                # tabela de referência de custos SINAPI</w:t>
+      </w:r>
+      <w:r>
+        <w:br/>
+      </w:r>
+      <w:r>
+        <w:rPr>
+          <w:rStyle w:val="VerbatimChar"/>
+        </w:rPr>
+        <w:t xml:space="preserve">lib/ifcXlsx.ts               # montagem da planilha (exceljs)</w:t>
+      </w:r>
+    </w:p>
+    <w:bookmarkEnd w:id="11"/>
+    <w:bookmarkEnd w:id="12"/>
+    <w:bookmarkStart w:id="13" w:name="fluxo-de-dados"/>
+    <w:p>
+      <w:pPr>
+        <w:pStyle w:val="Heading2"/>
+      </w:pPr>
+      <w:r>
+        <w:t xml:space="preserve">4. Fluxo de dados</w:t>
       </w:r>
     </w:p>
     <w:p>
@@ -275,28 +662,6 @@
         <w:pStyle w:val="Compact"/>
         <w:numPr>
           <w:ilvl w:val="0"/>
-          <w:numId w:val="1001"/>
-        </w:numPr>
-      </w:pPr>
-      <w:r>
-        <w:rPr>
-          <w:b/>
-          <w:bCs/>
-        </w:rPr>
-        <w:t xml:space="preserve">Fonte de Custos</w:t>
-      </w:r>
-      <w:r>
-        <w:t xml:space="preserve"> </w:t>
-      </w:r>
-      <w:r>
-        <w:t xml:space="preserve">selecionável:</w:t>
-      </w:r>
-    </w:p>
-    <w:p>
-      <w:pPr>
-        <w:pStyle w:val="Compact"/>
-        <w:numPr>
-          <w:ilvl w:val="1"/>
           <w:numId w:val="1002"/>
         </w:numPr>
       </w:pPr>
@@ -305,75 +670,28 @@
           <w:b/>
           <w:bCs/>
         </w:rPr>
-        <w:t xml:space="preserve">SINAPI</w:t>
-      </w:r>
-      <w:r>
-        <w:t xml:space="preserve"> </w:t>
-      </w:r>
-      <w:r>
-        <w:t xml:space="preserve">(padrão) — preços de referência (SP, não desonerado) alimentam a</w:t>
-      </w:r>
-      <w:r>
-        <w:t xml:space="preserve"> </w:t>
-      </w:r>
-      <w:r>
-        <w:t xml:space="preserve">coluna de preço unitário, com a unidade compatível ao serviço. Mostra o</w:t>
-      </w:r>
-      <w:r>
-        <w:t xml:space="preserve"> </w:t>
-      </w:r>
-      <w:r>
-        <w:t xml:space="preserve">código/descrição da composição SINAPI usada.</w:t>
-      </w:r>
-    </w:p>
-    <w:p>
-      <w:pPr>
-        <w:pStyle w:val="Compact"/>
-        <w:numPr>
-          <w:ilvl w:val="1"/>
-          <w:numId w:val="1002"/>
-        </w:numPr>
-      </w:pPr>
-      <w:r>
-        <w:rPr>
-          <w:b/>
-          <w:bCs/>
-        </w:rPr>
-        <w:t xml:space="preserve">Inserido pelo Usuário</w:t>
-      </w:r>
-      <w:r>
-        <w:t xml:space="preserve"> </w:t>
-      </w:r>
-      <w:r>
-        <w:t xml:space="preserve">— preços digitados manualmente.</w:t>
-      </w:r>
-    </w:p>
-    <w:p>
-      <w:pPr>
-        <w:pStyle w:val="Compact"/>
-        <w:numPr>
-          <w:ilvl w:val="1"/>
-          <w:numId w:val="1002"/>
-        </w:numPr>
-      </w:pPr>
-      <w:r>
-        <w:t xml:space="preserve">No modo SINAPI o usuário pode editar o preço de um item específico; o botão</w:t>
-      </w:r>
-      <w:r>
-        <w:t xml:space="preserve"> </w:t>
-      </w:r>
-      <w:r>
-        <w:rPr>
-          <w:b/>
-          <w:bCs/>
-        </w:rPr>
-        <w:t xml:space="preserve">↺ SINAPI</w:t>
-      </w:r>
-      <w:r>
-        <w:t xml:space="preserve"> </w:t>
-      </w:r>
-      <w:r>
-        <w:t xml:space="preserve">devolve aquele item à referência.</w:t>
+        <w:t xml:space="preserve">Upload</w:t>
+      </w:r>
+      <w:r>
+        <w:t xml:space="preserve"> </w:t>
+      </w:r>
+      <w:r>
+        <w:t xml:space="preserve">— o usuário seleciona um</w:t>
+      </w:r>
+      <w:r>
+        <w:t xml:space="preserve"> </w:t>
+      </w:r>
+      <w:r>
+        <w:rPr>
+          <w:rStyle w:val="VerbatimChar"/>
+        </w:rPr>
+        <w:t xml:space="preserve">.ifc</w:t>
+      </w:r>
+      <w:r>
+        <w:t xml:space="preserve"> </w:t>
+      </w:r>
+      <w:r>
+        <w:t xml:space="preserve">na interface.</w:t>
       </w:r>
     </w:p>
     <w:p>
@@ -381,11 +699,42 @@
         <w:pStyle w:val="Compact"/>
         <w:numPr>
           <w:ilvl w:val="0"/>
-          <w:numId w:val="1001"/>
+          <w:numId w:val="1002"/>
         </w:numPr>
       </w:pPr>
       <w:r>
-        <w:t xml:space="preserve">Destaque no modelo 3D dos objetos paramétricos de cada item do orçamento.</w:t>
+        <w:rPr>
+          <w:b/>
+          <w:bCs/>
+        </w:rPr>
+        <w:t xml:space="preserve">Parse</w:t>
+      </w:r>
+      <w:r>
+        <w:t xml:space="preserve"> </w:t>
+      </w:r>
+      <w:r>
+        <w:t xml:space="preserve">(</w:t>
+      </w:r>
+      <w:r>
+        <w:rPr>
+          <w:rStyle w:val="VerbatimChar"/>
+        </w:rPr>
+        <w:t xml:space="preserve">POST /api/ifc</w:t>
+      </w:r>
+      <w:r>
+        <w:t xml:space="preserve">) — o arquivo é lido pelo parser STEP, que extrai os</w:t>
+      </w:r>
+      <w:r>
+        <w:t xml:space="preserve"> </w:t>
+      </w:r>
+      <w:r>
+        <w:t xml:space="preserve">elementos (paredes, lajes, pilares, vigas, fundações, portas, janelas,</w:t>
+      </w:r>
+      <w:r>
+        <w:t xml:space="preserve"> </w:t>
+      </w:r>
+      <w:r>
+        <w:t xml:space="preserve">coberturas) e suas quantidades.</w:t>
       </w:r>
     </w:p>
     <w:p>
@@ -393,65 +742,160 @@
         <w:pStyle w:val="Compact"/>
         <w:numPr>
           <w:ilvl w:val="0"/>
-          <w:numId w:val="1001"/>
+          <w:numId w:val="1002"/>
         </w:numPr>
       </w:pPr>
       <w:r>
+        <w:rPr>
+          <w:b/>
+          <w:bCs/>
+        </w:rPr>
+        <w:t xml:space="preserve">Orçamentação</w:t>
+      </w:r>
+      <w:r>
+        <w:t xml:space="preserve"> </w:t>
+      </w:r>
+      <w:r>
+        <w:t xml:space="preserve">(</w:t>
+      </w:r>
+      <w:r>
+        <w:rPr>
+          <w:rStyle w:val="VerbatimChar"/>
+        </w:rPr>
+        <w:t xml:space="preserve">lib/budget.ts</w:t>
+      </w:r>
+      <w:r>
+        <w:t xml:space="preserve">) — os elementos viram itens de serviço</w:t>
+      </w:r>
+      <w:r>
+        <w:t xml:space="preserve"> </w:t>
+      </w:r>
+      <w:r>
+        <w:t xml:space="preserve">agrupados por etapa, com unidade e quantidade.</w:t>
+      </w:r>
+    </w:p>
+    <w:p>
+      <w:pPr>
+        <w:pStyle w:val="Compact"/>
+        <w:numPr>
+          <w:ilvl w:val="0"/>
+          <w:numId w:val="1002"/>
+        </w:numPr>
+      </w:pPr>
+      <w:r>
+        <w:rPr>
+          <w:b/>
+          <w:bCs/>
+        </w:rPr>
+        <w:t xml:space="preserve">Precificação</w:t>
+      </w:r>
+      <w:r>
+        <w:t xml:space="preserve"> </w:t>
+      </w:r>
+      <w:r>
+        <w:t xml:space="preserve">(</w:t>
+      </w:r>
+      <w:r>
+        <w:rPr>
+          <w:rStyle w:val="VerbatimChar"/>
+        </w:rPr>
+        <w:t xml:space="preserve">lib/sinapi.ts</w:t>
+      </w:r>
+      <w:r>
+        <w:t xml:space="preserve">) — cada item recebe um preço unitário de</w:t>
+      </w:r>
+      <w:r>
+        <w:t xml:space="preserve"> </w:t>
+      </w:r>
+      <w:r>
+        <w:t xml:space="preserve">referência SINAPI (ou inserido pelo usuário).</w:t>
+      </w:r>
+    </w:p>
+    <w:p>
+      <w:pPr>
+        <w:pStyle w:val="Compact"/>
+        <w:numPr>
+          <w:ilvl w:val="0"/>
+          <w:numId w:val="1002"/>
+        </w:numPr>
+      </w:pPr>
+      <w:r>
+        <w:rPr>
+          <w:b/>
+          <w:bCs/>
+        </w:rPr>
+        <w:t xml:space="preserve">Visualização</w:t>
+      </w:r>
+      <w:r>
+        <w:t xml:space="preserve"> </w:t>
+      </w:r>
+      <w:r>
+        <w:t xml:space="preserve">— a tabela é exibida na web; o modelo aparece em 3D.</w:t>
+      </w:r>
+    </w:p>
+    <w:p>
+      <w:pPr>
+        <w:pStyle w:val="Compact"/>
+        <w:numPr>
+          <w:ilvl w:val="0"/>
+          <w:numId w:val="1002"/>
+        </w:numPr>
+      </w:pPr>
+      <w:r>
+        <w:rPr>
+          <w:b/>
+          <w:bCs/>
+        </w:rPr>
         <w:t xml:space="preserve">Exportação</w:t>
       </w:r>
       <w:r>
         <w:t xml:space="preserve"> </w:t>
       </w:r>
       <w:r>
+        <w:t xml:space="preserve">(</w:t>
+      </w:r>
+      <w:r>
         <w:rPr>
           <w:rStyle w:val="VerbatimChar"/>
         </w:rPr>
+        <w:t xml:space="preserve">POST /api/ifc/export</w:t>
+      </w:r>
+      <w:r>
+        <w:t xml:space="preserve">) — gera o</w:t>
+      </w:r>
+      <w:r>
+        <w:t xml:space="preserve"> </w:t>
+      </w:r>
+      <w:r>
+        <w:rPr>
+          <w:rStyle w:val="VerbatimChar"/>
+        </w:rPr>
         <w:t xml:space="preserve">.xlsx</w:t>
       </w:r>
       <w:r>
         <w:t xml:space="preserve"> </w:t>
       </w:r>
       <w:r>
-        <w:t xml:space="preserve">com abas</w:t>
-      </w:r>
-      <w:r>
-        <w:t xml:space="preserve"> </w:t>
-      </w:r>
-      <w:r>
-        <w:rPr>
-          <w:b/>
-          <w:bCs/>
-        </w:rPr>
-        <w:t xml:space="preserve">Orçamento</w:t>
-      </w:r>
-      <w:r>
-        <w:t xml:space="preserve"> </w:t>
-      </w:r>
-      <w:r>
-        <w:t xml:space="preserve">e</w:t>
-      </w:r>
-      <w:r>
-        <w:t xml:space="preserve"> </w:t>
-      </w:r>
-      <w:r>
-        <w:rPr>
-          <w:b/>
-          <w:bCs/>
-        </w:rPr>
-        <w:t xml:space="preserve">Detalhe</w:t>
-      </w:r>
-      <w:r>
-        <w:t xml:space="preserve">.</w:t>
-      </w:r>
-    </w:p>
-    <w:bookmarkEnd w:id="9"/>
-    <w:bookmarkStart w:id="10" w:name="stack"/>
+        <w:t xml:space="preserve">com os preços efetivos.</w:t>
+      </w:r>
+    </w:p>
+    <w:bookmarkEnd w:id="13"/>
+    <w:bookmarkStart w:id="14" w:name="parser-ifc-libifc.ts"/>
     <w:p>
       <w:pPr>
         <w:pStyle w:val="Heading2"/>
       </w:pPr>
       <w:r>
-        <w:t xml:space="preserve">Stack</w:t>
+        <w:t xml:space="preserve">5. Parser IFC (</w:t>
+      </w:r>
+      <w:r>
+        <w:rPr>
+          <w:rStyle w:val="VerbatimChar"/>
+        </w:rPr>
+        <w:t xml:space="preserve">lib/ifc.ts</w:t>
+      </w:r>
+      <w:r>
+        <w:t xml:space="preserve">)</w:t>
       </w:r>
     </w:p>
     <w:p>
@@ -459,243 +903,26 @@
         <w:pStyle w:val="FirstParagraph"/>
       </w:pPr>
       <w:r>
-        <w:t xml:space="preserve">Next.js (App Router, TypeScript) · Tailwind CSS · exceljs · web-ifc (viewer 3D).</w:t>
-      </w:r>
-    </w:p>
-    <w:bookmarkEnd w:id="10"/>
-    <w:bookmarkStart w:id="11" w:name="desenvolvimento"/>
-    <w:p>
-      <w:pPr>
-        <w:pStyle w:val="Heading2"/>
-      </w:pPr>
-      <w:r>
-        <w:t xml:space="preserve">Desenvolvimento</w:t>
-      </w:r>
-    </w:p>
-    <w:p>
-      <w:pPr>
-        <w:pStyle w:val="SourceCode"/>
-      </w:pPr>
-      <w:r>
-        <w:rPr>
-          <w:rStyle w:val="VerbatimChar"/>
-        </w:rPr>
-        <w:t xml:space="preserve">npm install</w:t>
-      </w:r>
-      <w:r>
-        <w:br/>
-      </w:r>
-      <w:r>
-        <w:rPr>
-          <w:rStyle w:val="VerbatimChar"/>
-        </w:rPr>
-        <w:t xml:space="preserve">npm run dev        # http://localhost:3000</w:t>
-      </w:r>
-      <w:r>
-        <w:br/>
-      </w:r>
-      <w:r>
-        <w:rPr>
-          <w:rStyle w:val="VerbatimChar"/>
-        </w:rPr>
-        <w:t xml:space="preserve">npm run build</w:t>
-      </w:r>
-      <w:r>
-        <w:br/>
-      </w:r>
-      <w:r>
-        <w:rPr>
-          <w:rStyle w:val="VerbatimChar"/>
-        </w:rPr>
-        <w:t xml:space="preserve">npm run typecheck</w:t>
-      </w:r>
-    </w:p>
-    <w:p>
-      <w:pPr>
-        <w:pStyle w:val="FirstParagraph"/>
-      </w:pPr>
-      <w:r>
-        <w:t xml:space="preserve">Requer Node.js 18+ (testado com Node 24).</w:t>
-      </w:r>
-    </w:p>
-    <w:bookmarkEnd w:id="11"/>
-    <w:bookmarkStart w:id="12" w:name="estrutura"/>
-    <w:p>
-      <w:pPr>
-        <w:pStyle w:val="Heading2"/>
-      </w:pPr>
-      <w:r>
-        <w:t xml:space="preserve">Estrutura</w:t>
-      </w:r>
-    </w:p>
-    <w:p>
-      <w:pPr>
-        <w:pStyle w:val="SourceCode"/>
-      </w:pPr>
-      <w:r>
-        <w:rPr>
-          <w:rStyle w:val="VerbatimChar"/>
-        </w:rPr>
-        <w:t xml:space="preserve">app/page.tsx                 # UI: upload IFC, viewer 3D, tabela e download</w:t>
-      </w:r>
-      <w:r>
-        <w:br/>
-      </w:r>
-      <w:r>
-        <w:rPr>
-          <w:rStyle w:val="VerbatimChar"/>
-        </w:rPr>
-        <w:t xml:space="preserve">app/layout.tsx               # metadados, fontes (Inter + assinatura)</w:t>
-      </w:r>
-      <w:r>
-        <w:br/>
-      </w:r>
-      <w:r>
-        <w:rPr>
-          <w:rStyle w:val="VerbatimChar"/>
-        </w:rPr>
-        <w:t xml:space="preserve">app/api/ifc/route.ts         # parse do IFC -&gt; orçamento (JSON)</w:t>
-      </w:r>
-      <w:r>
-        <w:br/>
-      </w:r>
-      <w:r>
-        <w:rPr>
-          <w:rStyle w:val="VerbatimChar"/>
-        </w:rPr>
-        <w:t xml:space="preserve">app/api/ifc/export/route.ts  # gera a planilha .xlsx</w:t>
-      </w:r>
-      <w:r>
-        <w:br/>
-      </w:r>
-      <w:r>
-        <w:rPr>
-          <w:rStyle w:val="VerbatimChar"/>
-        </w:rPr>
-        <w:t xml:space="preserve">lib/ifc.ts                   # parser STEP + extração de quantidades + unidades</w:t>
-      </w:r>
-      <w:r>
-        <w:br/>
-      </w:r>
-      <w:r>
-        <w:rPr>
-          <w:rStyle w:val="VerbatimChar"/>
-        </w:rPr>
-        <w:t xml:space="preserve">lib/budget.ts                # tradução para itens de orçamento (PT-BR)</w:t>
-      </w:r>
-      <w:r>
-        <w:br/>
-      </w:r>
-      <w:r>
-        <w:rPr>
-          <w:rStyle w:val="VerbatimChar"/>
-        </w:rPr>
-        <w:t xml:space="preserve">lib/sinapi.ts                # tabela de referência de custos SINAPI</w:t>
-      </w:r>
-      <w:r>
-        <w:br/>
-      </w:r>
-      <w:r>
-        <w:rPr>
-          <w:rStyle w:val="VerbatimChar"/>
-        </w:rPr>
-        <w:t xml:space="preserve">lib/ifcXlsx.ts               # montagem da planilha (exceljs)</w:t>
-      </w:r>
-    </w:p>
-    <w:bookmarkEnd w:id="12"/>
-    <w:bookmarkStart w:id="13" w:name="sobre-os-preços-sinapi"/>
-    <w:p>
-      <w:pPr>
-        <w:pStyle w:val="Heading2"/>
-      </w:pPr>
-      <w:r>
-        <w:t xml:space="preserve">Sobre os preços SINAPI</w:t>
-      </w:r>
-    </w:p>
-    <w:p>
-      <w:pPr>
-        <w:pStyle w:val="FirstParagraph"/>
-      </w:pPr>
-      <w:r>
-        <w:t xml:space="preserve">Os valores em</w:t>
-      </w:r>
-      <w:r>
-        <w:t xml:space="preserve"> </w:t>
-      </w:r>
-      <w:r>
-        <w:rPr>
-          <w:rStyle w:val="VerbatimChar"/>
-        </w:rPr>
-        <w:t xml:space="preserve">lib/sinapi.ts</w:t>
-      </w:r>
-      <w:r>
-        <w:t xml:space="preserve"> </w:t>
-      </w:r>
-      <w:r>
-        <w:t xml:space="preserve">são</w:t>
-      </w:r>
-      <w:r>
-        <w:t xml:space="preserve"> </w:t>
-      </w:r>
-      <w:r>
-        <w:rPr>
-          <w:b/>
-          <w:bCs/>
-        </w:rPr>
-        <w:t xml:space="preserve">referências aproximadas</w:t>
-      </w:r>
-      <w:r>
-        <w:t xml:space="preserve"> </w:t>
-      </w:r>
-      <w:r>
-        <w:t xml:space="preserve">(SP, não</w:t>
-      </w:r>
-      <w:r>
-        <w:t xml:space="preserve"> </w:t>
-      </w:r>
-      <w:r>
-        <w:t xml:space="preserve">desonerado) mapeando cada item do orçamento à composição SINAPI mais próxima,</w:t>
-      </w:r>
-      <w:r>
-        <w:t xml:space="preserve"> </w:t>
-      </w:r>
-      <w:r>
-        <w:t xml:space="preserve">com</w:t>
-      </w:r>
-      <w:r>
-        <w:t xml:space="preserve"> </w:t>
-      </w:r>
-      <w:r>
-        <w:rPr>
-          <w:b/>
-          <w:bCs/>
-        </w:rPr>
-        <w:t xml:space="preserve">unidade compatível</w:t>
-      </w:r>
-      <w:r>
-        <w:t xml:space="preserve">. O SINAPI oficial é publicado mensalmente pela Caixa</w:t>
-      </w:r>
-      <w:r>
-        <w:t xml:space="preserve"> </w:t>
-      </w:r>
-      <w:r>
-        <w:t xml:space="preserve">por UF — ajuste os valores conforme o mês/estado do orçamento:</w:t>
-      </w:r>
-      <w:r>
-        <w:t xml:space="preserve"> </w:t>
-      </w:r>
-      <w:r>
-        <w:t xml:space="preserve">https://www.caixa.gov.br/site/Paginas/downloads.aspx</w:t>
-      </w:r>
-    </w:p>
-    <w:bookmarkEnd w:id="13"/>
-    <w:bookmarkStart w:id="14" w:name="limitações-próximos-passos"/>
-    <w:p>
-      <w:pPr>
-        <w:pStyle w:val="Heading2"/>
-      </w:pPr>
-      <w:r>
-        <w:t xml:space="preserve">Limitações / próximos passos</w:t>
+        <w:t xml:space="preserve">O IFC segue o padrão</w:t>
+      </w:r>
+      <w:r>
+        <w:t xml:space="preserve"> </w:t>
+      </w:r>
+      <w:r>
+        <w:rPr>
+          <w:b/>
+          <w:bCs/>
+        </w:rPr>
+        <w:t xml:space="preserve">STEP / ISO-10303-21</w:t>
+      </w:r>
+      <w:r>
+        <w:t xml:space="preserve">. O parser implementado é leve e não</w:t>
+      </w:r>
+      <w:r>
+        <w:t xml:space="preserve"> </w:t>
+      </w:r>
+      <w:r>
+        <w:t xml:space="preserve">usa WASM. Principais responsabilidades:</w:t>
       </w:r>
     </w:p>
     <w:p>
@@ -707,25 +934,56 @@
         </w:numPr>
       </w:pPr>
       <w:r>
-        <w:t xml:space="preserve">Quantificação por elemento (não por ambiente), pois o IFC de teste não traz</w:t>
-      </w:r>
-      <w:r>
-        <w:t xml:space="preserve"> </w:t>
+        <w:rPr>
+          <w:b/>
+          <w:bCs/>
+        </w:rPr>
+        <w:t xml:space="preserve">Leitura das entidades</w:t>
+      </w:r>
+      <w:r>
+        <w:t xml:space="preserve"> </w:t>
+      </w:r>
+      <w:r>
+        <w:t xml:space="preserve">(</w:t>
       </w:r>
       <w:r>
         <w:rPr>
           <w:rStyle w:val="VerbatimChar"/>
         </w:rPr>
-        <w:t xml:space="preserve">IfcSpace</w:t>
-      </w:r>
-      <w:r>
-        <w:t xml:space="preserve">. Suporte a área de piso por cômodo pode ser adicionado quando o IFC</w:t>
-      </w:r>
-      <w:r>
-        <w:t xml:space="preserve"> </w:t>
-      </w:r>
-      <w:r>
-        <w:t xml:space="preserve">trouxer espaços.</w:t>
+        <w:t xml:space="preserve">#id = IFCTIPO(args)</w:t>
+      </w:r>
+      <w:r>
+        <w:t xml:space="preserve">) e dos conjuntos de</w:t>
+      </w:r>
+      <w:r>
+        <w:t xml:space="preserve"> </w:t>
+      </w:r>
+      <w:r>
+        <w:t xml:space="preserve">quantidades (</w:t>
+      </w:r>
+      <w:r>
+        <w:rPr>
+          <w:rStyle w:val="VerbatimChar"/>
+        </w:rPr>
+        <w:t xml:space="preserve">IfcElementQuantity</w:t>
+      </w:r>
+      <w:r>
+        <w:t xml:space="preserve"> </w:t>
+      </w:r>
+      <w:r>
+        <w:t xml:space="preserve">/</w:t>
+      </w:r>
+      <w:r>
+        <w:t xml:space="preserve"> </w:t>
+      </w:r>
+      <w:r>
+        <w:rPr>
+          <w:rStyle w:val="VerbatimChar"/>
+        </w:rPr>
+        <w:t xml:space="preserve">BaseQuantities</w:t>
+      </w:r>
+      <w:r>
+        <w:t xml:space="preserve">).</w:t>
       </w:r>
     </w:p>
     <w:p>
@@ -737,7 +995,20 @@
         </w:numPr>
       </w:pPr>
       <w:r>
-        <w:t xml:space="preserve">Classificação externa/interna de paredes por palavra-chave do nome.</w:t>
+        <w:rPr>
+          <w:b/>
+          <w:bCs/>
+        </w:rPr>
+        <w:t xml:space="preserve">Normalização de unidades</w:t>
+      </w:r>
+      <w:r>
+        <w:t xml:space="preserve">: comprimentos mm→m, áreas mm²→m², volumes mm³→m³,</w:t>
+      </w:r>
+      <w:r>
+        <w:t xml:space="preserve"> </w:t>
+      </w:r>
+      <w:r>
+        <w:t xml:space="preserve">com heurística por magnitude do valor.</w:t>
       </w:r>
     </w:p>
     <w:p>
@@ -749,13 +1020,23 @@
         </w:numPr>
       </w:pPr>
       <w:r>
-        <w:t xml:space="preserve">Cobertura usa a face inferior das lajes de telhado (forro), não a superfície</w:t>
-      </w:r>
-      <w:r>
-        <w:t xml:space="preserve"> </w:t>
-      </w:r>
-      <w:r>
-        <w:t xml:space="preserve">total da laje.</w:t>
+        <w:rPr>
+          <w:b/>
+          <w:bCs/>
+        </w:rPr>
+        <w:t xml:space="preserve">Deduplicação</w:t>
+      </w:r>
+      <w:r>
+        <w:t xml:space="preserve"> </w:t>
+      </w:r>
+      <w:r>
+        <w:t xml:space="preserve">de quantidades repetidas pelo exportador (mantém o valor</w:t>
+      </w:r>
+      <w:r>
+        <w:t xml:space="preserve"> </w:t>
+      </w:r>
+      <w:r>
+        <w:t xml:space="preserve">líquido / mínimo coerente).</w:t>
       </w:r>
     </w:p>
     <w:p>
@@ -767,17 +1048,1369 @@
         </w:numPr>
       </w:pPr>
       <w:r>
-        <w:t xml:space="preserve">A referência SINAPI é estática e regional (SP); evoluir para múltiplas UFs e</w:t>
-      </w:r>
-      <w:r>
-        <w:t xml:space="preserve"> </w:t>
-      </w:r>
-      <w:r>
-        <w:t xml:space="preserve">atualização por mês de referência.</w:t>
+        <w:rPr>
+          <w:b/>
+          <w:bCs/>
+        </w:rPr>
+        <w:t xml:space="preserve">Fallback geométrico</w:t>
+      </w:r>
+      <w:r>
+        <w:t xml:space="preserve">: quando um elemento não tem</w:t>
+      </w:r>
+      <w:r>
+        <w:t xml:space="preserve"> </w:t>
+      </w:r>
+      <w:r>
+        <w:rPr>
+          <w:rStyle w:val="VerbatimChar"/>
+        </w:rPr>
+        <w:t xml:space="preserve">BaseQuantities</w:t>
+      </w:r>
+      <w:r>
+        <w:t xml:space="preserve">, tenta</w:t>
+      </w:r>
+      <w:r>
+        <w:t xml:space="preserve"> </w:t>
+      </w:r>
+      <w:r>
+        <w:t xml:space="preserve">derivar a quantidade a partir da geometria (ex.:</w:t>
+      </w:r>
+      <w:r>
+        <w:t xml:space="preserve"> </w:t>
+      </w:r>
+      <w:r>
+        <w:rPr>
+          <w:rStyle w:val="VerbatimChar"/>
+        </w:rPr>
+        <w:t xml:space="preserve">IfcExtrudedAreaSolid</w:t>
+      </w:r>
+      <w:r>
+        <w:t xml:space="preserve"> </w:t>
+      </w:r>
+      <w:r>
+        <w:t xml:space="preserve">+</w:t>
+      </w:r>
+      <w:r>
+        <w:t xml:space="preserve"> </w:t>
+      </w:r>
+      <w:r>
+        <w:rPr>
+          <w:rStyle w:val="VerbatimChar"/>
+        </w:rPr>
+        <w:t xml:space="preserve">IfcRectangleProfileDef</w:t>
+      </w:r>
+      <w:r>
+        <w:t xml:space="preserve">).</w:t>
       </w:r>
     </w:p>
     <w:bookmarkEnd w:id="14"/>
+    <w:bookmarkStart w:id="15" w:name="regras-de-orçamento-libbudget.ts"/>
+    <w:p>
+      <w:pPr>
+        <w:pStyle w:val="Heading2"/>
+      </w:pPr>
+      <w:r>
+        <w:t xml:space="preserve">6. Regras de orçamento (</w:t>
+      </w:r>
+      <w:r>
+        <w:rPr>
+          <w:rStyle w:val="VerbatimChar"/>
+        </w:rPr>
+        <w:t xml:space="preserve">lib/budget.ts</w:t>
+      </w:r>
+      <w:r>
+        <w:t xml:space="preserve">)</w:t>
+      </w:r>
+    </w:p>
+    <w:p>
+      <w:pPr>
+        <w:pStyle w:val="FirstParagraph"/>
+      </w:pPr>
+      <w:r>
+        <w:t xml:space="preserve">Os elementos IFC são convertidos em itens agrupados por etapa. Resumo:</w:t>
+      </w:r>
+    </w:p>
+    <w:tbl>
+      <w:tblPr>
+        <w:tblStyle w:val="Table"/>
+        <w:tblW w:type="pct" w:w="5000"/>
+        <w:tblLayout w:type="fixed"/>
+        <w:tblLook w:firstRow="1" w:lastRow="0" w:firstColumn="0" w:lastColumn="0" w:noHBand="0" w:noVBand="0" w:val="0020"/>
+      </w:tblPr>
+      <w:tblGrid>
+        <w:gridCol w:w="2640"/>
+        <w:gridCol w:w="2640"/>
+        <w:gridCol w:w="2640"/>
+      </w:tblGrid>
+      <w:tr>
+        <w:trPr>
+          <w:tblHeader w:val="on"/>
+        </w:trPr>
+        <w:tc>
+          <w:tcPr/>
+          <w:p>
+            <w:pPr>
+              <w:pStyle w:val="Compact"/>
+            </w:pPr>
+            <w:r>
+              <w:t xml:space="preserve">Etapa</w:t>
+            </w:r>
+          </w:p>
+        </w:tc>
+        <w:tc>
+          <w:tcPr/>
+          <w:p>
+            <w:pPr>
+              <w:pStyle w:val="Compact"/>
+            </w:pPr>
+            <w:r>
+              <w:t xml:space="preserve">Itens (exemplos)</w:t>
+            </w:r>
+          </w:p>
+        </w:tc>
+        <w:tc>
+          <w:tcPr/>
+          <w:p>
+            <w:pPr>
+              <w:pStyle w:val="Compact"/>
+            </w:pPr>
+            <w:r>
+              <w:t xml:space="preserve">Unidade</w:t>
+            </w:r>
+          </w:p>
+        </w:tc>
+      </w:tr>
+      <w:tr>
+        <w:tc>
+          <w:tcPr/>
+          <w:p>
+            <w:pPr>
+              <w:pStyle w:val="Compact"/>
+            </w:pPr>
+            <w:r>
+              <w:t xml:space="preserve">1. Serviços preliminares</w:t>
+            </w:r>
+          </w:p>
+        </w:tc>
+        <w:tc>
+          <w:tcPr/>
+          <w:p>
+            <w:pPr>
+              <w:pStyle w:val="Compact"/>
+            </w:pPr>
+            <w:r>
+              <w:t xml:space="preserve">Limpeza do terreno, locação da obra</w:t>
+            </w:r>
+          </w:p>
+        </w:tc>
+        <w:tc>
+          <w:tcPr/>
+          <w:p>
+            <w:pPr>
+              <w:pStyle w:val="Compact"/>
+            </w:pPr>
+            <w:r>
+              <w:t xml:space="preserve">m², m</w:t>
+            </w:r>
+          </w:p>
+        </w:tc>
+      </w:tr>
+      <w:tr>
+        <w:tc>
+          <w:tcPr/>
+          <w:p>
+            <w:pPr>
+              <w:pStyle w:val="Compact"/>
+            </w:pPr>
+            <w:r>
+              <w:t xml:space="preserve">2. Fundações</w:t>
+            </w:r>
+          </w:p>
+        </w:tc>
+        <w:tc>
+          <w:tcPr/>
+          <w:p>
+            <w:pPr>
+              <w:pStyle w:val="Compact"/>
+            </w:pPr>
+            <w:r>
+              <w:t xml:space="preserve">Concreto, fôrmas, armadura</w:t>
+            </w:r>
+          </w:p>
+        </w:tc>
+        <w:tc>
+          <w:tcPr/>
+          <w:p>
+            <w:pPr>
+              <w:pStyle w:val="Compact"/>
+            </w:pPr>
+            <w:r>
+              <w:t xml:space="preserve">m³, m², kg</w:t>
+            </w:r>
+          </w:p>
+        </w:tc>
+      </w:tr>
+      <w:tr>
+        <w:tc>
+          <w:tcPr/>
+          <w:p>
+            <w:pPr>
+              <w:pStyle w:val="Compact"/>
+            </w:pPr>
+            <w:r>
+              <w:t xml:space="preserve">3. Superestrutura</w:t>
+            </w:r>
+          </w:p>
+        </w:tc>
+        <w:tc>
+          <w:tcPr/>
+          <w:p>
+            <w:pPr>
+              <w:pStyle w:val="Compact"/>
+            </w:pPr>
+            <w:r>
+              <w:t xml:space="preserve">Concreto em pilares/vigas/lajes, fôrmas, armadura</w:t>
+            </w:r>
+          </w:p>
+        </w:tc>
+        <w:tc>
+          <w:tcPr/>
+          <w:p>
+            <w:pPr>
+              <w:pStyle w:val="Compact"/>
+            </w:pPr>
+            <w:r>
+              <w:t xml:space="preserve">m³, m², kg</w:t>
+            </w:r>
+          </w:p>
+        </w:tc>
+      </w:tr>
+      <w:tr>
+        <w:tc>
+          <w:tcPr/>
+          <w:p>
+            <w:pPr>
+              <w:pStyle w:val="Compact"/>
+            </w:pPr>
+            <w:r>
+              <w:t xml:space="preserve">4. Alvenaria/Vedações</w:t>
+            </w:r>
+          </w:p>
+        </w:tc>
+        <w:tc>
+          <w:tcPr/>
+          <w:p>
+            <w:pPr>
+              <w:pStyle w:val="Compact"/>
+            </w:pPr>
+            <w:r>
+              <w:t xml:space="preserve">Paredes externas e internas</w:t>
+            </w:r>
+          </w:p>
+        </w:tc>
+        <w:tc>
+          <w:tcPr/>
+          <w:p>
+            <w:pPr>
+              <w:pStyle w:val="Compact"/>
+            </w:pPr>
+            <w:r>
+              <w:t xml:space="preserve">m²</w:t>
+            </w:r>
+          </w:p>
+        </w:tc>
+      </w:tr>
+      <w:tr>
+        <w:tc>
+          <w:tcPr/>
+          <w:p>
+            <w:pPr>
+              <w:pStyle w:val="Compact"/>
+            </w:pPr>
+            <w:r>
+              <w:t xml:space="preserve">5. Cobertura</w:t>
+            </w:r>
+          </w:p>
+        </w:tc>
+        <w:tc>
+          <w:tcPr/>
+          <w:p>
+            <w:pPr>
+              <w:pStyle w:val="Compact"/>
+            </w:pPr>
+            <w:r>
+              <w:t xml:space="preserve">Telhamento (inclui estrutura)</w:t>
+            </w:r>
+          </w:p>
+        </w:tc>
+        <w:tc>
+          <w:tcPr/>
+          <w:p>
+            <w:pPr>
+              <w:pStyle w:val="Compact"/>
+            </w:pPr>
+            <w:r>
+              <w:t xml:space="preserve">m²</w:t>
+            </w:r>
+          </w:p>
+        </w:tc>
+      </w:tr>
+      <w:tr>
+        <w:tc>
+          <w:tcPr/>
+          <w:p>
+            <w:pPr>
+              <w:pStyle w:val="Compact"/>
+            </w:pPr>
+            <w:r>
+              <w:t xml:space="preserve">6. Esquadrias</w:t>
+            </w:r>
+          </w:p>
+        </w:tc>
+        <w:tc>
+          <w:tcPr/>
+          <w:p>
+            <w:pPr>
+              <w:pStyle w:val="Compact"/>
+            </w:pPr>
+            <w:r>
+              <w:t xml:space="preserve">Portas, janelas e seus vãos</w:t>
+            </w:r>
+          </w:p>
+        </w:tc>
+        <w:tc>
+          <w:tcPr/>
+          <w:p>
+            <w:pPr>
+              <w:pStyle w:val="Compact"/>
+            </w:pPr>
+            <w:r>
+              <w:t xml:space="preserve">un, m²</w:t>
+            </w:r>
+          </w:p>
+        </w:tc>
+      </w:tr>
+      <w:tr>
+        <w:tc>
+          <w:tcPr/>
+          <w:p>
+            <w:pPr>
+              <w:pStyle w:val="Compact"/>
+            </w:pPr>
+            <w:r>
+              <w:t xml:space="preserve">7. Revestimentos</w:t>
+            </w:r>
+          </w:p>
+        </w:tc>
+        <w:tc>
+          <w:tcPr/>
+          <w:p>
+            <w:pPr>
+              <w:pStyle w:val="Compact"/>
+            </w:pPr>
+            <w:r>
+              <w:t xml:space="preserve">Chapisco, emboço, reboco</w:t>
+            </w:r>
+          </w:p>
+        </w:tc>
+        <w:tc>
+          <w:tcPr/>
+          <w:p>
+            <w:pPr>
+              <w:pStyle w:val="Compact"/>
+            </w:pPr>
+            <w:r>
+              <w:t xml:space="preserve">m²</w:t>
+            </w:r>
+          </w:p>
+        </w:tc>
+      </w:tr>
+      <w:tr>
+        <w:tc>
+          <w:tcPr/>
+          <w:p>
+            <w:pPr>
+              <w:pStyle w:val="Compact"/>
+            </w:pPr>
+            <w:r>
+              <w:t xml:space="preserve">8. Pisos</w:t>
+            </w:r>
+          </w:p>
+        </w:tc>
+        <w:tc>
+          <w:tcPr/>
+          <w:p>
+            <w:pPr>
+              <w:pStyle w:val="Compact"/>
+            </w:pPr>
+            <w:r>
+              <w:t xml:space="preserve">Contrapiso, revestimento de piso</w:t>
+            </w:r>
+          </w:p>
+        </w:tc>
+        <w:tc>
+          <w:tcPr/>
+          <w:p>
+            <w:pPr>
+              <w:pStyle w:val="Compact"/>
+            </w:pPr>
+            <w:r>
+              <w:t xml:space="preserve">m²</w:t>
+            </w:r>
+          </w:p>
+        </w:tc>
+      </w:tr>
+      <w:tr>
+        <w:tc>
+          <w:tcPr/>
+          <w:p>
+            <w:pPr>
+              <w:pStyle w:val="Compact"/>
+            </w:pPr>
+            <w:r>
+              <w:t xml:space="preserve">9. Pintura</w:t>
+            </w:r>
+          </w:p>
+        </w:tc>
+        <w:tc>
+          <w:tcPr/>
+          <w:p>
+            <w:pPr>
+              <w:pStyle w:val="Compact"/>
+            </w:pPr>
+            <w:r>
+              <w:t xml:space="preserve">Paredes e teto/forro</w:t>
+            </w:r>
+          </w:p>
+        </w:tc>
+        <w:tc>
+          <w:tcPr/>
+          <w:p>
+            <w:pPr>
+              <w:pStyle w:val="Compact"/>
+            </w:pPr>
+            <w:r>
+              <w:t xml:space="preserve">m²</w:t>
+            </w:r>
+          </w:p>
+        </w:tc>
+      </w:tr>
+    </w:tbl>
+    <w:p>
+      <w:pPr>
+        <w:pStyle w:val="BodyText"/>
+      </w:pPr>
+      <w:r>
+        <w:t xml:space="preserve">Critérios de engenharia adotados:</w:t>
+      </w:r>
+    </w:p>
+    <w:p>
+      <w:pPr>
+        <w:pStyle w:val="Compact"/>
+        <w:numPr>
+          <w:ilvl w:val="0"/>
+          <w:numId w:val="1004"/>
+        </w:numPr>
+      </w:pPr>
+      <w:r>
+        <w:rPr>
+          <w:b/>
+          <w:bCs/>
+        </w:rPr>
+        <w:t xml:space="preserve">Paredes</w:t>
+      </w:r>
+      <w:r>
+        <w:t xml:space="preserve"> </w:t>
+      </w:r>
+      <w:r>
+        <w:t xml:space="preserve">classificadas em externa/interna por palavra-chave do nome; área de</w:t>
+      </w:r>
+      <w:r>
+        <w:t xml:space="preserve"> </w:t>
+      </w:r>
+      <w:r>
+        <w:t xml:space="preserve">revestimento considera 1 face para externas e 2 faces para internas.</w:t>
+      </w:r>
+    </w:p>
+    <w:p>
+      <w:pPr>
+        <w:pStyle w:val="Compact"/>
+        <w:numPr>
+          <w:ilvl w:val="0"/>
+          <w:numId w:val="1004"/>
+        </w:numPr>
+      </w:pPr>
+      <w:r>
+        <w:rPr>
+          <w:b/>
+          <w:bCs/>
+        </w:rPr>
+        <w:t xml:space="preserve">Cobertura</w:t>
+      </w:r>
+      <w:r>
+        <w:t xml:space="preserve"> </w:t>
+      </w:r>
+      <w:r>
+        <w:t xml:space="preserve">usa a</w:t>
+      </w:r>
+      <w:r>
+        <w:t xml:space="preserve"> </w:t>
+      </w:r>
+      <w:r>
+        <w:rPr>
+          <w:b/>
+          <w:bCs/>
+        </w:rPr>
+        <w:t xml:space="preserve">face inferior</w:t>
+      </w:r>
+      <w:r>
+        <w:t xml:space="preserve"> </w:t>
+      </w:r>
+      <w:r>
+        <w:t xml:space="preserve">das lajes de telhado (forro) — não a</w:t>
+      </w:r>
+      <w:r>
+        <w:t xml:space="preserve"> </w:t>
+      </w:r>
+      <w:r>
+        <w:t xml:space="preserve">superfície total da laje (que somaria faces e bordas).</w:t>
+      </w:r>
+    </w:p>
+    <w:p>
+      <w:pPr>
+        <w:pStyle w:val="Compact"/>
+        <w:numPr>
+          <w:ilvl w:val="0"/>
+          <w:numId w:val="1004"/>
+        </w:numPr>
+      </w:pPr>
+      <w:r>
+        <w:rPr>
+          <w:b/>
+          <w:bCs/>
+        </w:rPr>
+        <w:t xml:space="preserve">Pintura de teto</w:t>
+      </w:r>
+      <w:r>
+        <w:t xml:space="preserve"> </w:t>
+      </w:r>
+      <w:r>
+        <w:t xml:space="preserve">só aparece quando existe laje de teto no modelo.</w:t>
+      </w:r>
+    </w:p>
+    <w:p>
+      <w:pPr>
+        <w:pStyle w:val="Compact"/>
+        <w:numPr>
+          <w:ilvl w:val="0"/>
+          <w:numId w:val="1004"/>
+        </w:numPr>
+      </w:pPr>
+      <w:r>
+        <w:t xml:space="preserve">Itens marcados como</w:t>
+      </w:r>
+      <w:r>
+        <w:t xml:space="preserve"> </w:t>
+      </w:r>
+      <w:r>
+        <w:rPr>
+          <w:b/>
+          <w:bCs/>
+        </w:rPr>
+        <w:t xml:space="preserve">(estimado)</w:t>
+      </w:r>
+      <w:r>
+        <w:t xml:space="preserve"> </w:t>
+      </w:r>
+      <w:r>
+        <w:t xml:space="preserve">derivam de premissas paramétricas (ex.:</w:t>
+      </w:r>
+      <w:r>
+        <w:t xml:space="preserve"> </w:t>
+      </w:r>
+      <w:r>
+        <w:t xml:space="preserve">~10 m² de fôrma por m³ de concreto, ~100 kg/m³ de armadura).</w:t>
+      </w:r>
+    </w:p>
     <w:bookmarkEnd w:id="15"/>
+    <w:bookmarkStart w:id="16" w:name="precificação-sinapi-libsinapi.ts"/>
+    <w:p>
+      <w:pPr>
+        <w:pStyle w:val="Heading2"/>
+      </w:pPr>
+      <w:r>
+        <w:t xml:space="preserve">7. Precificação SINAPI (</w:t>
+      </w:r>
+      <w:r>
+        <w:rPr>
+          <w:rStyle w:val="VerbatimChar"/>
+        </w:rPr>
+        <w:t xml:space="preserve">lib/sinapi.ts</w:t>
+      </w:r>
+      <w:r>
+        <w:t xml:space="preserve">)</w:t>
+      </w:r>
+    </w:p>
+    <w:p>
+      <w:pPr>
+        <w:pStyle w:val="FirstParagraph"/>
+      </w:pPr>
+      <w:r>
+        <w:t xml:space="preserve">O app oferece uma</w:t>
+      </w:r>
+      <w:r>
+        <w:t xml:space="preserve"> </w:t>
+      </w:r>
+      <w:r>
+        <w:rPr>
+          <w:b/>
+          <w:bCs/>
+        </w:rPr>
+        <w:t xml:space="preserve">Fonte de Custos</w:t>
+      </w:r>
+      <w:r>
+        <w:t xml:space="preserve"> </w:t>
+      </w:r>
+      <w:r>
+        <w:t xml:space="preserve">selecionável no topo:</w:t>
+      </w:r>
+    </w:p>
+    <w:p>
+      <w:pPr>
+        <w:pStyle w:val="Compact"/>
+        <w:numPr>
+          <w:ilvl w:val="0"/>
+          <w:numId w:val="1005"/>
+        </w:numPr>
+      </w:pPr>
+      <w:r>
+        <w:rPr>
+          <w:b/>
+          <w:bCs/>
+        </w:rPr>
+        <w:t xml:space="preserve">SINAPI (padrão)</w:t>
+      </w:r>
+      <w:r>
+        <w:t xml:space="preserve"> </w:t>
+      </w:r>
+      <w:r>
+        <w:t xml:space="preserve">— preços de referência (estado de</w:t>
+      </w:r>
+      <w:r>
+        <w:t xml:space="preserve"> </w:t>
+      </w:r>
+      <w:r>
+        <w:rPr>
+          <w:b/>
+          <w:bCs/>
+        </w:rPr>
+        <w:t xml:space="preserve">SP</w:t>
+      </w:r>
+      <w:r>
+        <w:t xml:space="preserve">, regime</w:t>
+      </w:r>
+      <w:r>
+        <w:t xml:space="preserve"> </w:t>
+      </w:r>
+      <w:r>
+        <w:rPr>
+          <w:b/>
+          <w:bCs/>
+        </w:rPr>
+        <w:t xml:space="preserve">não</w:t>
+      </w:r>
+      <w:r>
+        <w:rPr>
+          <w:b/>
+          <w:bCs/>
+        </w:rPr>
+        <w:t xml:space="preserve"> </w:t>
+      </w:r>
+      <w:r>
+        <w:rPr>
+          <w:b/>
+          <w:bCs/>
+        </w:rPr>
+        <w:t xml:space="preserve">desonerado</w:t>
+      </w:r>
+      <w:r>
+        <w:t xml:space="preserve">) alimentam a coluna de preço unitário. Cada item do orçamento é</w:t>
+      </w:r>
+      <w:r>
+        <w:t xml:space="preserve"> </w:t>
+      </w:r>
+      <w:r>
+        <w:t xml:space="preserve">mapeado para a composição SINAPI mais próxima, garantindo</w:t>
+      </w:r>
+      <w:r>
+        <w:t xml:space="preserve"> </w:t>
+      </w:r>
+      <w:r>
+        <w:rPr>
+          <w:b/>
+          <w:bCs/>
+        </w:rPr>
+        <w:t xml:space="preserve">unidade</w:t>
+      </w:r>
+      <w:r>
+        <w:rPr>
+          <w:b/>
+          <w:bCs/>
+        </w:rPr>
+        <w:t xml:space="preserve"> </w:t>
+      </w:r>
+      <w:r>
+        <w:rPr>
+          <w:b/>
+          <w:bCs/>
+        </w:rPr>
+        <w:t xml:space="preserve">compatível</w:t>
+      </w:r>
+      <w:r>
+        <w:t xml:space="preserve">. A interface exibe o código/descrição da composição usada.</w:t>
+      </w:r>
+    </w:p>
+    <w:p>
+      <w:pPr>
+        <w:pStyle w:val="Compact"/>
+        <w:numPr>
+          <w:ilvl w:val="0"/>
+          <w:numId w:val="1005"/>
+        </w:numPr>
+      </w:pPr>
+      <w:r>
+        <w:rPr>
+          <w:b/>
+          <w:bCs/>
+        </w:rPr>
+        <w:t xml:space="preserve">Inserido pelo Usuário</w:t>
+      </w:r>
+      <w:r>
+        <w:t xml:space="preserve"> </w:t>
+      </w:r>
+      <w:r>
+        <w:t xml:space="preserve">— todos os preços são digitados manualmente.</w:t>
+      </w:r>
+    </w:p>
+    <w:p>
+      <w:pPr>
+        <w:pStyle w:val="FirstParagraph"/>
+      </w:pPr>
+      <w:r>
+        <w:t xml:space="preserve">No modo SINAPI, o usuário ainda pode</w:t>
+      </w:r>
+      <w:r>
+        <w:t xml:space="preserve"> </w:t>
+      </w:r>
+      <w:r>
+        <w:rPr>
+          <w:b/>
+          <w:bCs/>
+        </w:rPr>
+        <w:t xml:space="preserve">editar</w:t>
+      </w:r>
+      <w:r>
+        <w:t xml:space="preserve"> </w:t>
+      </w:r>
+      <w:r>
+        <w:t xml:space="preserve">o preço de um item específico</w:t>
+      </w:r>
+      <w:r>
+        <w:t xml:space="preserve"> </w:t>
+      </w:r>
+      <w:r>
+        <w:t xml:space="preserve">(que então deixa de mostrar o código SINAPI); o botão</w:t>
+      </w:r>
+      <w:r>
+        <w:t xml:space="preserve"> </w:t>
+      </w:r>
+      <w:r>
+        <w:rPr>
+          <w:b/>
+          <w:bCs/>
+        </w:rPr>
+        <w:t xml:space="preserve">↺ SINAPI</w:t>
+      </w:r>
+      <w:r>
+        <w:t xml:space="preserve"> </w:t>
+      </w:r>
+      <w:r>
+        <w:t xml:space="preserve">devolve aquele</w:t>
+      </w:r>
+      <w:r>
+        <w:t xml:space="preserve"> </w:t>
+      </w:r>
+      <w:r>
+        <w:t xml:space="preserve">item ao valor de referência.</w:t>
+      </w:r>
+    </w:p>
+    <w:p>
+      <w:pPr>
+        <w:pStyle w:val="BlockText"/>
+      </w:pPr>
+      <w:r>
+        <w:t xml:space="preserve">Os valores SINAPI embutidos são</w:t>
+      </w:r>
+      <w:r>
+        <w:t xml:space="preserve"> </w:t>
+      </w:r>
+      <w:r>
+        <w:rPr>
+          <w:b/>
+          <w:bCs/>
+        </w:rPr>
+        <w:t xml:space="preserve">referências aproximadas</w:t>
+      </w:r>
+      <w:r>
+        <w:t xml:space="preserve">. O SINAPI oficial é</w:t>
+      </w:r>
+      <w:r>
+        <w:t xml:space="preserve"> </w:t>
+      </w:r>
+      <w:r>
+        <w:t xml:space="preserve">publicado mensalmente pela Caixa por UF; recomenda-se revisar os números de</w:t>
+      </w:r>
+      <w:r>
+        <w:t xml:space="preserve"> </w:t>
+      </w:r>
+      <w:r>
+        <w:rPr>
+          <w:rStyle w:val="VerbatimChar"/>
+        </w:rPr>
+        <w:t xml:space="preserve">lib/sinapi.ts</w:t>
+      </w:r>
+      <w:r>
+        <w:t xml:space="preserve"> </w:t>
+      </w:r>
+      <w:r>
+        <w:t xml:space="preserve">conforme o mês/estado do orçamento.</w:t>
+      </w:r>
+      <w:r>
+        <w:t xml:space="preserve"> </w:t>
+      </w:r>
+      <w:r>
+        <w:t xml:space="preserve">https://www.caixa.gov.br/site/Paginas/downloads.aspx</w:t>
+      </w:r>
+    </w:p>
+    <w:bookmarkEnd w:id="16"/>
+    <w:bookmarkStart w:id="17" w:name="exportação-excel-libifcxlsx.ts"/>
+    <w:p>
+      <w:pPr>
+        <w:pStyle w:val="Heading2"/>
+      </w:pPr>
+      <w:r>
+        <w:t xml:space="preserve">8. Exportação Excel (</w:t>
+      </w:r>
+      <w:r>
+        <w:rPr>
+          <w:rStyle w:val="VerbatimChar"/>
+        </w:rPr>
+        <w:t xml:space="preserve">lib/ifcXlsx.ts</w:t>
+      </w:r>
+      <w:r>
+        <w:t xml:space="preserve">)</w:t>
+      </w:r>
+    </w:p>
+    <w:p>
+      <w:pPr>
+        <w:pStyle w:val="FirstParagraph"/>
+      </w:pPr>
+      <w:r>
+        <w:t xml:space="preserve">A planilha</w:t>
+      </w:r>
+      <w:r>
+        <w:t xml:space="preserve"> </w:t>
+      </w:r>
+      <w:r>
+        <w:rPr>
+          <w:rStyle w:val="VerbatimChar"/>
+        </w:rPr>
+        <w:t xml:space="preserve">.xlsx</w:t>
+      </w:r>
+      <w:r>
+        <w:t xml:space="preserve"> </w:t>
+      </w:r>
+      <w:r>
+        <w:t xml:space="preserve">é montada com</w:t>
+      </w:r>
+      <w:r>
+        <w:t xml:space="preserve"> </w:t>
+      </w:r>
+      <w:r>
+        <w:rPr>
+          <w:b/>
+          <w:bCs/>
+        </w:rPr>
+        <w:t xml:space="preserve">exceljs</w:t>
+      </w:r>
+      <w:r>
+        <w:t xml:space="preserve"> </w:t>
+      </w:r>
+      <w:r>
+        <w:t xml:space="preserve">e contém:</w:t>
+      </w:r>
+    </w:p>
+    <w:p>
+      <w:pPr>
+        <w:pStyle w:val="Compact"/>
+        <w:numPr>
+          <w:ilvl w:val="0"/>
+          <w:numId w:val="1006"/>
+        </w:numPr>
+      </w:pPr>
+      <w:r>
+        <w:rPr>
+          <w:b/>
+          <w:bCs/>
+        </w:rPr>
+        <w:t xml:space="preserve">Orçamento</w:t>
+      </w:r>
+      <w:r>
+        <w:t xml:space="preserve"> </w:t>
+      </w:r>
+      <w:r>
+        <w:t xml:space="preserve">— código, etapa, serviço, unidade, quantidade, preço unitário,</w:t>
+      </w:r>
+      <w:r>
+        <w:t xml:space="preserve"> </w:t>
+      </w:r>
+      <w:r>
+        <w:t xml:space="preserve">total e critério/observação, com linha de total geral.</w:t>
+      </w:r>
+    </w:p>
+    <w:p>
+      <w:pPr>
+        <w:pStyle w:val="Compact"/>
+        <w:numPr>
+          <w:ilvl w:val="0"/>
+          <w:numId w:val="1006"/>
+        </w:numPr>
+      </w:pPr>
+      <w:r>
+        <w:rPr>
+          <w:b/>
+          <w:bCs/>
+        </w:rPr>
+        <w:t xml:space="preserve">Detalhe</w:t>
+      </w:r>
+      <w:r>
+        <w:t xml:space="preserve"> </w:t>
+      </w:r>
+      <w:r>
+        <w:t xml:space="preserve">— lista por elemento (tipo, nome, GUID, área, comprimento, volume).</w:t>
+      </w:r>
+    </w:p>
+    <w:bookmarkEnd w:id="17"/>
+    <w:bookmarkStart w:id="18" w:name="visualizador-3d"/>
+    <w:p>
+      <w:pPr>
+        <w:pStyle w:val="Heading2"/>
+      </w:pPr>
+      <w:r>
+        <w:t xml:space="preserve">9. Visualizador 3D</w:t>
+      </w:r>
+    </w:p>
+    <w:p>
+      <w:pPr>
+        <w:pStyle w:val="FirstParagraph"/>
+      </w:pPr>
+      <w:r>
+        <w:t xml:space="preserve">O modelo IFC é renderizado com</w:t>
+      </w:r>
+      <w:r>
+        <w:t xml:space="preserve"> </w:t>
+      </w:r>
+      <w:r>
+        <w:rPr>
+          <w:b/>
+          <w:bCs/>
+        </w:rPr>
+        <w:t xml:space="preserve">web-ifc</w:t>
+      </w:r>
+      <w:r>
+        <w:t xml:space="preserve">. Cada item do orçamento pode</w:t>
+      </w:r>
+      <w:r>
+        <w:t xml:space="preserve"> </w:t>
+      </w:r>
+      <w:r>
+        <w:rPr>
+          <w:b/>
+          <w:bCs/>
+        </w:rPr>
+        <w:t xml:space="preserve">destacar</w:t>
+      </w:r>
+      <w:r>
+        <w:t xml:space="preserve"> </w:t>
+      </w:r>
+      <w:r>
+        <w:t xml:space="preserve">no modelo os objetos paramétricos que originaram sua quantidade,</w:t>
+      </w:r>
+      <w:r>
+        <w:t xml:space="preserve"> </w:t>
+      </w:r>
+      <w:r>
+        <w:t xml:space="preserve">facilitando a conferência visual do takeoff.</w:t>
+      </w:r>
+    </w:p>
+    <w:bookmarkEnd w:id="18"/>
+    <w:bookmarkStart w:id="20" w:name="como-executar"/>
+    <w:p>
+      <w:pPr>
+        <w:pStyle w:val="Heading2"/>
+      </w:pPr>
+      <w:r>
+        <w:t xml:space="preserve">10. Como executar</w:t>
+      </w:r>
+    </w:p>
+    <w:p>
+      <w:pPr>
+        <w:pStyle w:val="SourceCode"/>
+      </w:pPr>
+      <w:r>
+        <w:rPr>
+          <w:rStyle w:val="VerbatimChar"/>
+        </w:rPr>
+        <w:t xml:space="preserve">npm install</w:t>
+      </w:r>
+      <w:r>
+        <w:br/>
+      </w:r>
+      <w:r>
+        <w:rPr>
+          <w:rStyle w:val="VerbatimChar"/>
+        </w:rPr>
+        <w:t xml:space="preserve">npm run dev        # http://localhost:3000</w:t>
+      </w:r>
+      <w:r>
+        <w:br/>
+      </w:r>
+      <w:r>
+        <w:rPr>
+          <w:rStyle w:val="VerbatimChar"/>
+        </w:rPr>
+        <w:t xml:space="preserve">npm run build</w:t>
+      </w:r>
+      <w:r>
+        <w:br/>
+      </w:r>
+      <w:r>
+        <w:rPr>
+          <w:rStyle w:val="VerbatimChar"/>
+        </w:rPr>
+        <w:t xml:space="preserve">npm run typecheck</w:t>
+      </w:r>
+    </w:p>
+    <w:p>
+      <w:pPr>
+        <w:pStyle w:val="FirstParagraph"/>
+      </w:pPr>
+      <w:r>
+        <w:t xml:space="preserve">Requer Node.js 18+ (testado com Node 24).</w:t>
+      </w:r>
+    </w:p>
+    <w:bookmarkStart w:id="19" w:name="uso"/>
+    <w:p>
+      <w:pPr>
+        <w:pStyle w:val="Heading3"/>
+      </w:pPr>
+      <w:r>
+        <w:t xml:space="preserve">Uso</w:t>
+      </w:r>
+    </w:p>
+    <w:p>
+      <w:pPr>
+        <w:pStyle w:val="Compact"/>
+        <w:numPr>
+          <w:ilvl w:val="0"/>
+          <w:numId w:val="1007"/>
+        </w:numPr>
+      </w:pPr>
+      <w:r>
+        <w:t xml:space="preserve">Abra</w:t>
+      </w:r>
+      <w:r>
+        <w:t xml:space="preserve"> </w:t>
+      </w:r>
+      <w:r>
+        <w:rPr>
+          <w:rStyle w:val="VerbatimChar"/>
+        </w:rPr>
+        <w:t xml:space="preserve">http://localhost:3000</w:t>
+      </w:r>
+      <w:r>
+        <w:t xml:space="preserve">.</w:t>
+      </w:r>
+    </w:p>
+    <w:p>
+      <w:pPr>
+        <w:pStyle w:val="Compact"/>
+        <w:numPr>
+          <w:ilvl w:val="0"/>
+          <w:numId w:val="1007"/>
+        </w:numPr>
+      </w:pPr>
+      <w:r>
+        <w:t xml:space="preserve">Clique em</w:t>
+      </w:r>
+      <w:r>
+        <w:t xml:space="preserve"> </w:t>
+      </w:r>
+      <w:r>
+        <w:rPr>
+          <w:b/>
+          <w:bCs/>
+        </w:rPr>
+        <w:t xml:space="preserve">Abrir IFC</w:t>
+      </w:r>
+      <w:r>
+        <w:t xml:space="preserve"> </w:t>
+      </w:r>
+      <w:r>
+        <w:t xml:space="preserve">e selecione um arquivo</w:t>
+      </w:r>
+      <w:r>
+        <w:t xml:space="preserve"> </w:t>
+      </w:r>
+      <w:r>
+        <w:rPr>
+          <w:rStyle w:val="VerbatimChar"/>
+        </w:rPr>
+        <w:t xml:space="preserve">.ifc</w:t>
+      </w:r>
+      <w:r>
+        <w:t xml:space="preserve">.</w:t>
+      </w:r>
+    </w:p>
+    <w:p>
+      <w:pPr>
+        <w:pStyle w:val="Compact"/>
+        <w:numPr>
+          <w:ilvl w:val="0"/>
+          <w:numId w:val="1007"/>
+        </w:numPr>
+      </w:pPr>
+      <w:r>
+        <w:t xml:space="preserve">Confira o modelo 3D e a planilha; ajuste a</w:t>
+      </w:r>
+      <w:r>
+        <w:t xml:space="preserve"> </w:t>
+      </w:r>
+      <w:r>
+        <w:rPr>
+          <w:b/>
+          <w:bCs/>
+        </w:rPr>
+        <w:t xml:space="preserve">Fonte de Custos</w:t>
+      </w:r>
+      <w:r>
+        <w:t xml:space="preserve"> </w:t>
+      </w:r>
+      <w:r>
+        <w:t xml:space="preserve">e os preços.</w:t>
+      </w:r>
+    </w:p>
+    <w:p>
+      <w:pPr>
+        <w:pStyle w:val="Compact"/>
+        <w:numPr>
+          <w:ilvl w:val="0"/>
+          <w:numId w:val="1007"/>
+        </w:numPr>
+      </w:pPr>
+      <w:r>
+        <w:t xml:space="preserve">Clique em</w:t>
+      </w:r>
+      <w:r>
+        <w:t xml:space="preserve"> </w:t>
+      </w:r>
+      <w:r>
+        <w:rPr>
+          <w:b/>
+          <w:bCs/>
+        </w:rPr>
+        <w:t xml:space="preserve">Exportar Excel</w:t>
+      </w:r>
+      <w:r>
+        <w:t xml:space="preserve">.</w:t>
+      </w:r>
+    </w:p>
+    <w:bookmarkEnd w:id="19"/>
+    <w:bookmarkEnd w:id="20"/>
+    <w:bookmarkStart w:id="21" w:name="validação"/>
+    <w:p>
+      <w:pPr>
+        <w:pStyle w:val="Heading2"/>
+      </w:pPr>
+      <w:r>
+        <w:t xml:space="preserve">11. Validação</w:t>
+      </w:r>
+    </w:p>
+    <w:p>
+      <w:pPr>
+        <w:pStyle w:val="FirstParagraph"/>
+      </w:pPr>
+      <w:r>
+        <w:t xml:space="preserve">Testado com o modelo</w:t>
+      </w:r>
+      <w:r>
+        <w:t xml:space="preserve"> </w:t>
+      </w:r>
+      <w:r>
+        <w:rPr>
+          <w:b/>
+          <w:bCs/>
+        </w:rPr>
+        <w:t xml:space="preserve">BasicHouse.ifc</w:t>
+      </w:r>
+      <w:r>
+        <w:t xml:space="preserve"> </w:t>
+      </w:r>
+      <w:r>
+        <w:t xml:space="preserve">(IFC2X3 exportado do Revit). As</w:t>
+      </w:r>
+      <w:r>
+        <w:t xml:space="preserve"> </w:t>
+      </w:r>
+      <w:r>
+        <w:t xml:space="preserve">quantidades e os preços foram conferidos item a item, validando a compatibilidade</w:t>
+      </w:r>
+      <w:r>
+        <w:t xml:space="preserve"> </w:t>
+      </w:r>
+      <w:r>
+        <w:t xml:space="preserve">de unidades entre o app e a referência SINAPI.</w:t>
+      </w:r>
+    </w:p>
+    <w:bookmarkEnd w:id="21"/>
+    <w:bookmarkStart w:id="22" w:name="limitações-e-próximos-passos"/>
+    <w:p>
+      <w:pPr>
+        <w:pStyle w:val="Heading2"/>
+      </w:pPr>
+      <w:r>
+        <w:t xml:space="preserve">12. Limitações e próximos passos</w:t>
+      </w:r>
+    </w:p>
+    <w:p>
+      <w:pPr>
+        <w:pStyle w:val="Compact"/>
+        <w:numPr>
+          <w:ilvl w:val="0"/>
+          <w:numId w:val="1008"/>
+        </w:numPr>
+      </w:pPr>
+      <w:r>
+        <w:t xml:space="preserve">Quantificação</w:t>
+      </w:r>
+      <w:r>
+        <w:t xml:space="preserve"> </w:t>
+      </w:r>
+      <w:r>
+        <w:rPr>
+          <w:b/>
+          <w:bCs/>
+        </w:rPr>
+        <w:t xml:space="preserve">por elemento</w:t>
+      </w:r>
+      <w:r>
+        <w:t xml:space="preserve">, não por ambiente (o IFC de teste não traz</w:t>
+      </w:r>
+      <w:r>
+        <w:t xml:space="preserve"> </w:t>
+      </w:r>
+      <w:r>
+        <w:rPr>
+          <w:rStyle w:val="VerbatimChar"/>
+        </w:rPr>
+        <w:t xml:space="preserve">IfcSpace</w:t>
+      </w:r>
+      <w:r>
+        <w:t xml:space="preserve">). Suporte a área por cômodo pode ser adicionado quando houver</w:t>
+      </w:r>
+      <w:r>
+        <w:t xml:space="preserve"> </w:t>
+      </w:r>
+      <w:r>
+        <w:t xml:space="preserve">espaços no modelo.</w:t>
+      </w:r>
+    </w:p>
+    <w:p>
+      <w:pPr>
+        <w:pStyle w:val="Compact"/>
+        <w:numPr>
+          <w:ilvl w:val="0"/>
+          <w:numId w:val="1008"/>
+        </w:numPr>
+      </w:pPr>
+      <w:r>
+        <w:t xml:space="preserve">Classificação externa/interna de paredes por</w:t>
+      </w:r>
+      <w:r>
+        <w:t xml:space="preserve"> </w:t>
+      </w:r>
+      <w:r>
+        <w:rPr>
+          <w:b/>
+          <w:bCs/>
+        </w:rPr>
+        <w:t xml:space="preserve">palavra-chave</w:t>
+      </w:r>
+      <w:r>
+        <w:t xml:space="preserve"> </w:t>
+      </w:r>
+      <w:r>
+        <w:t xml:space="preserve">do nome.</w:t>
+      </w:r>
+    </w:p>
+    <w:p>
+      <w:pPr>
+        <w:pStyle w:val="Compact"/>
+        <w:numPr>
+          <w:ilvl w:val="0"/>
+          <w:numId w:val="1008"/>
+        </w:numPr>
+      </w:pPr>
+      <w:r>
+        <w:t xml:space="preserve">Referência SINAPI</w:t>
+      </w:r>
+      <w:r>
+        <w:t xml:space="preserve"> </w:t>
+      </w:r>
+      <w:r>
+        <w:rPr>
+          <w:b/>
+          <w:bCs/>
+        </w:rPr>
+        <w:t xml:space="preserve">estática</w:t>
+      </w:r>
+      <w:r>
+        <w:t xml:space="preserve"> </w:t>
+      </w:r>
+      <w:r>
+        <w:t xml:space="preserve">e regional (SP) — evoluir para múltiplas UFs e</w:t>
+      </w:r>
+      <w:r>
+        <w:t xml:space="preserve"> </w:t>
+      </w:r>
+      <w:r>
+        <w:t xml:space="preserve">seleção do mês de referência.</w:t>
+      </w:r>
+    </w:p>
+    <w:p>
+      <w:pPr>
+        <w:pStyle w:val="Compact"/>
+        <w:numPr>
+          <w:ilvl w:val="0"/>
+          <w:numId w:val="1008"/>
+        </w:numPr>
+      </w:pPr>
+      <w:r>
+        <w:t xml:space="preserve">Possível adicionar BDI, encargos e composição detalhada de preços.</w:t>
+      </w:r>
+    </w:p>
+    <w:bookmarkEnd w:id="22"/>
+    <w:bookmarkEnd w:id="23"/>
     <w:sectPr>
       <w:footnotePr>
         <w:numRestart w:val="eachSect"/>
@@ -991,6 +2624,91 @@
       </w:rPr>
     </w:lvl>
   </w:abstractNum>
+  <w:abstractNum w:abstractNumId="99411">
+    <w:nsid w:val="00A99411"/>
+    <w:multiLevelType w:val="multilevel"/>
+    <w:lvl w:ilvl="0">
+      <w:start w:val="1"/>
+      <w:numFmt w:val="decimal"/>
+      <w:lvlText w:val="%1."/>
+      <w:lvlJc w:val="left"/>
+      <w:pPr>
+        <w:ind w:left="720" w:hanging="360"/>
+      </w:pPr>
+    </w:lvl>
+    <w:lvl w:ilvl="1">
+      <w:start w:val="1"/>
+      <w:numFmt w:val="decimal"/>
+      <w:lvlText w:val="%2."/>
+      <w:lvlJc w:val="left"/>
+      <w:pPr>
+        <w:ind w:left="1440" w:hanging="360"/>
+      </w:pPr>
+    </w:lvl>
+    <w:lvl w:ilvl="2">
+      <w:start w:val="1"/>
+      <w:numFmt w:val="decimal"/>
+      <w:lvlText w:val="%3."/>
+      <w:lvlJc w:val="left"/>
+      <w:pPr>
+        <w:ind w:left="2160" w:hanging="360"/>
+      </w:pPr>
+    </w:lvl>
+    <w:lvl w:ilvl="3">
+      <w:start w:val="1"/>
+      <w:numFmt w:val="decimal"/>
+      <w:lvlText w:val="%4."/>
+      <w:lvlJc w:val="left"/>
+      <w:pPr>
+        <w:ind w:left="2880" w:hanging="360"/>
+      </w:pPr>
+    </w:lvl>
+    <w:lvl w:ilvl="4">
+      <w:start w:val="1"/>
+      <w:numFmt w:val="decimal"/>
+      <w:lvlText w:val="%5."/>
+      <w:lvlJc w:val="left"/>
+      <w:pPr>
+        <w:ind w:left="3600" w:hanging="360"/>
+      </w:pPr>
+    </w:lvl>
+    <w:lvl w:ilvl="5">
+      <w:start w:val="1"/>
+      <w:numFmt w:val="decimal"/>
+      <w:lvlText w:val="%6."/>
+      <w:lvlJc w:val="left"/>
+      <w:pPr>
+        <w:ind w:left="4320" w:hanging="360"/>
+      </w:pPr>
+    </w:lvl>
+    <w:lvl w:ilvl="6">
+      <w:start w:val="1"/>
+      <w:numFmt w:val="decimal"/>
+      <w:lvlText w:val="%7."/>
+      <w:lvlJc w:val="left"/>
+      <w:pPr>
+        <w:ind w:left="5040" w:hanging="360"/>
+      </w:pPr>
+    </w:lvl>
+    <w:lvl w:ilvl="7">
+      <w:start w:val="1"/>
+      <w:numFmt w:val="decimal"/>
+      <w:lvlText w:val="%8."/>
+      <w:lvlJc w:val="left"/>
+      <w:pPr>
+        <w:ind w:left="5760" w:hanging="360"/>
+      </w:pPr>
+    </w:lvl>
+    <w:lvl w:ilvl="8">
+      <w:start w:val="1"/>
+      <w:numFmt w:val="decimal"/>
+      <w:lvlText w:val="%9."/>
+      <w:lvlJc w:val="left"/>
+      <w:pPr>
+        <w:ind w:left="6480" w:hanging="360"/>
+      </w:pPr>
+    </w:lvl>
+  </w:abstractNum>
   <w:num w:numId="1000">
     <w:abstractNumId w:val="990"/>
   </w:num>
@@ -998,9 +2716,78 @@
     <w:abstractNumId w:val="991"/>
   </w:num>
   <w:num w:numId="1002">
+    <w:abstractNumId w:val="99411"/>
+    <w:lvlOverride w:ilvl="0">
+      <w:startOverride w:val="1"/>
+    </w:lvlOverride>
+    <w:lvlOverride w:ilvl="1">
+      <w:startOverride w:val="1"/>
+    </w:lvlOverride>
+    <w:lvlOverride w:ilvl="2">
+      <w:startOverride w:val="1"/>
+    </w:lvlOverride>
+    <w:lvlOverride w:ilvl="3">
+      <w:startOverride w:val="1"/>
+    </w:lvlOverride>
+    <w:lvlOverride w:ilvl="4">
+      <w:startOverride w:val="1"/>
+    </w:lvlOverride>
+    <w:lvlOverride w:ilvl="5">
+      <w:startOverride w:val="1"/>
+    </w:lvlOverride>
+    <w:lvlOverride w:ilvl="6">
+      <w:startOverride w:val="1"/>
+    </w:lvlOverride>
+    <w:lvlOverride w:ilvl="7">
+      <w:startOverride w:val="1"/>
+    </w:lvlOverride>
+    <w:lvlOverride w:ilvl="8">
+      <w:startOverride w:val="1"/>
+    </w:lvlOverride>
+  </w:num>
+  <w:num w:numId="1003">
     <w:abstractNumId w:val="991"/>
   </w:num>
-  <w:num w:numId="1003">
+  <w:num w:numId="1004">
+    <w:abstractNumId w:val="991"/>
+  </w:num>
+  <w:num w:numId="1005">
+    <w:abstractNumId w:val="991"/>
+  </w:num>
+  <w:num w:numId="1006">
+    <w:abstractNumId w:val="991"/>
+  </w:num>
+  <w:num w:numId="1007">
+    <w:abstractNumId w:val="99411"/>
+    <w:lvlOverride w:ilvl="0">
+      <w:startOverride w:val="1"/>
+    </w:lvlOverride>
+    <w:lvlOverride w:ilvl="1">
+      <w:startOverride w:val="1"/>
+    </w:lvlOverride>
+    <w:lvlOverride w:ilvl="2">
+      <w:startOverride w:val="1"/>
+    </w:lvlOverride>
+    <w:lvlOverride w:ilvl="3">
+      <w:startOverride w:val="1"/>
+    </w:lvlOverride>
+    <w:lvlOverride w:ilvl="4">
+      <w:startOverride w:val="1"/>
+    </w:lvlOverride>
+    <w:lvlOverride w:ilvl="5">
+      <w:startOverride w:val="1"/>
+    </w:lvlOverride>
+    <w:lvlOverride w:ilvl="6">
+      <w:startOverride w:val="1"/>
+    </w:lvlOverride>
+    <w:lvlOverride w:ilvl="7">
+      <w:startOverride w:val="1"/>
+    </w:lvlOverride>
+    <w:lvlOverride w:ilvl="8">
+      <w:startOverride w:val="1"/>
+    </w:lvlOverride>
+  </w:num>
+  <w:num w:numId="1008">
     <w:abstractNumId w:val="991"/>
   </w:num>
 </w:numbering>

</xml_diff>

<commit_message>
Documentacao: secao de metodologia com agentes (backend, frontend, QA, orcamentista)
Co-Authored-By: Claude Opus 4.8 <noreply@anthropic.com>
</commit_message>
<xml_diff>
--- a/entregaveis/Documentacao.docx
+++ b/entregaveis/Documentacao.docx
@@ -2,7 +2,7 @@
 <file path=word/document.xml><?xml version="1.0" encoding="utf-8"?>
 <w:document xmlns:w="http://schemas.openxmlformats.org/wordprocessingml/2006/main" xmlns:m="http://schemas.openxmlformats.org/officeDocument/2006/math" xmlns:r="http://schemas.openxmlformats.org/officeDocument/2006/relationships" xmlns:o="urn:schemas-microsoft-com:office:office" xmlns:v="urn:schemas-microsoft-com:vml" xmlns:w10="urn:schemas-microsoft-com:office:word" xmlns:a="http://schemas.openxmlformats.org/drawingml/2006/main" xmlns:pic="http://schemas.openxmlformats.org/drawingml/2006/picture" xmlns:wp="http://schemas.openxmlformats.org/drawingml/2006/wordprocessingDrawing">
   <w:body>
-    <w:bookmarkStart w:id="23" w:name="X666ca8d24a4861566f438bb5c0367a600567e18"/>
+    <w:bookmarkStart w:id="24" w:name="X666ca8d24a4861566f438bb5c0367a600567e18"/>
     <w:p>
       <w:pPr>
         <w:pStyle w:val="Heading1"/>
@@ -648,254 +648,13 @@
     </w:p>
     <w:bookmarkEnd w:id="11"/>
     <w:bookmarkEnd w:id="12"/>
-    <w:bookmarkStart w:id="13" w:name="fluxo-de-dados"/>
+    <w:bookmarkStart w:id="13" w:name="Xb0c36831acbb8b989f52a085a0831906ba529cc"/>
     <w:p>
       <w:pPr>
         <w:pStyle w:val="Heading2"/>
       </w:pPr>
       <w:r>
-        <w:t xml:space="preserve">4. Fluxo de dados</w:t>
-      </w:r>
-    </w:p>
-    <w:p>
-      <w:pPr>
-        <w:pStyle w:val="Compact"/>
-        <w:numPr>
-          <w:ilvl w:val="0"/>
-          <w:numId w:val="1002"/>
-        </w:numPr>
-      </w:pPr>
-      <w:r>
-        <w:rPr>
-          <w:b/>
-          <w:bCs/>
-        </w:rPr>
-        <w:t xml:space="preserve">Upload</w:t>
-      </w:r>
-      <w:r>
-        <w:t xml:space="preserve"> </w:t>
-      </w:r>
-      <w:r>
-        <w:t xml:space="preserve">— o usuário seleciona um</w:t>
-      </w:r>
-      <w:r>
-        <w:t xml:space="preserve"> </w:t>
-      </w:r>
-      <w:r>
-        <w:rPr>
-          <w:rStyle w:val="VerbatimChar"/>
-        </w:rPr>
-        <w:t xml:space="preserve">.ifc</w:t>
-      </w:r>
-      <w:r>
-        <w:t xml:space="preserve"> </w:t>
-      </w:r>
-      <w:r>
-        <w:t xml:space="preserve">na interface.</w:t>
-      </w:r>
-    </w:p>
-    <w:p>
-      <w:pPr>
-        <w:pStyle w:val="Compact"/>
-        <w:numPr>
-          <w:ilvl w:val="0"/>
-          <w:numId w:val="1002"/>
-        </w:numPr>
-      </w:pPr>
-      <w:r>
-        <w:rPr>
-          <w:b/>
-          <w:bCs/>
-        </w:rPr>
-        <w:t xml:space="preserve">Parse</w:t>
-      </w:r>
-      <w:r>
-        <w:t xml:space="preserve"> </w:t>
-      </w:r>
-      <w:r>
-        <w:t xml:space="preserve">(</w:t>
-      </w:r>
-      <w:r>
-        <w:rPr>
-          <w:rStyle w:val="VerbatimChar"/>
-        </w:rPr>
-        <w:t xml:space="preserve">POST /api/ifc</w:t>
-      </w:r>
-      <w:r>
-        <w:t xml:space="preserve">) — o arquivo é lido pelo parser STEP, que extrai os</w:t>
-      </w:r>
-      <w:r>
-        <w:t xml:space="preserve"> </w:t>
-      </w:r>
-      <w:r>
-        <w:t xml:space="preserve">elementos (paredes, lajes, pilares, vigas, fundações, portas, janelas,</w:t>
-      </w:r>
-      <w:r>
-        <w:t xml:space="preserve"> </w:t>
-      </w:r>
-      <w:r>
-        <w:t xml:space="preserve">coberturas) e suas quantidades.</w:t>
-      </w:r>
-    </w:p>
-    <w:p>
-      <w:pPr>
-        <w:pStyle w:val="Compact"/>
-        <w:numPr>
-          <w:ilvl w:val="0"/>
-          <w:numId w:val="1002"/>
-        </w:numPr>
-      </w:pPr>
-      <w:r>
-        <w:rPr>
-          <w:b/>
-          <w:bCs/>
-        </w:rPr>
-        <w:t xml:space="preserve">Orçamentação</w:t>
-      </w:r>
-      <w:r>
-        <w:t xml:space="preserve"> </w:t>
-      </w:r>
-      <w:r>
-        <w:t xml:space="preserve">(</w:t>
-      </w:r>
-      <w:r>
-        <w:rPr>
-          <w:rStyle w:val="VerbatimChar"/>
-        </w:rPr>
-        <w:t xml:space="preserve">lib/budget.ts</w:t>
-      </w:r>
-      <w:r>
-        <w:t xml:space="preserve">) — os elementos viram itens de serviço</w:t>
-      </w:r>
-      <w:r>
-        <w:t xml:space="preserve"> </w:t>
-      </w:r>
-      <w:r>
-        <w:t xml:space="preserve">agrupados por etapa, com unidade e quantidade.</w:t>
-      </w:r>
-    </w:p>
-    <w:p>
-      <w:pPr>
-        <w:pStyle w:val="Compact"/>
-        <w:numPr>
-          <w:ilvl w:val="0"/>
-          <w:numId w:val="1002"/>
-        </w:numPr>
-      </w:pPr>
-      <w:r>
-        <w:rPr>
-          <w:b/>
-          <w:bCs/>
-        </w:rPr>
-        <w:t xml:space="preserve">Precificação</w:t>
-      </w:r>
-      <w:r>
-        <w:t xml:space="preserve"> </w:t>
-      </w:r>
-      <w:r>
-        <w:t xml:space="preserve">(</w:t>
-      </w:r>
-      <w:r>
-        <w:rPr>
-          <w:rStyle w:val="VerbatimChar"/>
-        </w:rPr>
-        <w:t xml:space="preserve">lib/sinapi.ts</w:t>
-      </w:r>
-      <w:r>
-        <w:t xml:space="preserve">) — cada item recebe um preço unitário de</w:t>
-      </w:r>
-      <w:r>
-        <w:t xml:space="preserve"> </w:t>
-      </w:r>
-      <w:r>
-        <w:t xml:space="preserve">referência SINAPI (ou inserido pelo usuário).</w:t>
-      </w:r>
-    </w:p>
-    <w:p>
-      <w:pPr>
-        <w:pStyle w:val="Compact"/>
-        <w:numPr>
-          <w:ilvl w:val="0"/>
-          <w:numId w:val="1002"/>
-        </w:numPr>
-      </w:pPr>
-      <w:r>
-        <w:rPr>
-          <w:b/>
-          <w:bCs/>
-        </w:rPr>
-        <w:t xml:space="preserve">Visualização</w:t>
-      </w:r>
-      <w:r>
-        <w:t xml:space="preserve"> </w:t>
-      </w:r>
-      <w:r>
-        <w:t xml:space="preserve">— a tabela é exibida na web; o modelo aparece em 3D.</w:t>
-      </w:r>
-    </w:p>
-    <w:p>
-      <w:pPr>
-        <w:pStyle w:val="Compact"/>
-        <w:numPr>
-          <w:ilvl w:val="0"/>
-          <w:numId w:val="1002"/>
-        </w:numPr>
-      </w:pPr>
-      <w:r>
-        <w:rPr>
-          <w:b/>
-          <w:bCs/>
-        </w:rPr>
-        <w:t xml:space="preserve">Exportação</w:t>
-      </w:r>
-      <w:r>
-        <w:t xml:space="preserve"> </w:t>
-      </w:r>
-      <w:r>
-        <w:t xml:space="preserve">(</w:t>
-      </w:r>
-      <w:r>
-        <w:rPr>
-          <w:rStyle w:val="VerbatimChar"/>
-        </w:rPr>
-        <w:t xml:space="preserve">POST /api/ifc/export</w:t>
-      </w:r>
-      <w:r>
-        <w:t xml:space="preserve">) — gera o</w:t>
-      </w:r>
-      <w:r>
-        <w:t xml:space="preserve"> </w:t>
-      </w:r>
-      <w:r>
-        <w:rPr>
-          <w:rStyle w:val="VerbatimChar"/>
-        </w:rPr>
-        <w:t xml:space="preserve">.xlsx</w:t>
-      </w:r>
-      <w:r>
-        <w:t xml:space="preserve"> </w:t>
-      </w:r>
-      <w:r>
-        <w:t xml:space="preserve">com os preços efetivos.</w:t>
-      </w:r>
-    </w:p>
-    <w:bookmarkEnd w:id="13"/>
-    <w:bookmarkStart w:id="14" w:name="parser-ifc-libifc.ts"/>
-    <w:p>
-      <w:pPr>
-        <w:pStyle w:val="Heading2"/>
-      </w:pPr>
-      <w:r>
-        <w:t xml:space="preserve">5. Parser IFC (</w:t>
-      </w:r>
-      <w:r>
-        <w:rPr>
-          <w:rStyle w:val="VerbatimChar"/>
-        </w:rPr>
-        <w:t xml:space="preserve">lib/ifc.ts</w:t>
-      </w:r>
-      <w:r>
-        <w:t xml:space="preserve">)</w:t>
+        <w:t xml:space="preserve">4. Metodologia de desenvolvimento com agentes de IA</w:t>
       </w:r>
     </w:p>
     <w:p>
@@ -903,231 +662,32 @@
         <w:pStyle w:val="FirstParagraph"/>
       </w:pPr>
       <w:r>
-        <w:t xml:space="preserve">O IFC segue o padrão</w:t>
-      </w:r>
-      <w:r>
-        <w:t xml:space="preserve"> </w:t>
-      </w:r>
-      <w:r>
-        <w:rPr>
-          <w:b/>
-          <w:bCs/>
-        </w:rPr>
-        <w:t xml:space="preserve">STEP / ISO-10303-21</w:t>
-      </w:r>
-      <w:r>
-        <w:t xml:space="preserve">. O parser implementado é leve e não</w:t>
-      </w:r>
-      <w:r>
-        <w:t xml:space="preserve"> </w:t>
-      </w:r>
-      <w:r>
-        <w:t xml:space="preserve">usa WASM. Principais responsabilidades:</w:t>
-      </w:r>
-    </w:p>
-    <w:p>
-      <w:pPr>
-        <w:pStyle w:val="Compact"/>
-        <w:numPr>
-          <w:ilvl w:val="0"/>
-          <w:numId w:val="1003"/>
-        </w:numPr>
-      </w:pPr>
-      <w:r>
-        <w:rPr>
-          <w:b/>
-          <w:bCs/>
-        </w:rPr>
-        <w:t xml:space="preserve">Leitura das entidades</w:t>
-      </w:r>
-      <w:r>
-        <w:t xml:space="preserve"> </w:t>
-      </w:r>
-      <w:r>
-        <w:t xml:space="preserve">(</w:t>
-      </w:r>
-      <w:r>
-        <w:rPr>
-          <w:rStyle w:val="VerbatimChar"/>
-        </w:rPr>
-        <w:t xml:space="preserve">#id = IFCTIPO(args)</w:t>
-      </w:r>
-      <w:r>
-        <w:t xml:space="preserve">) e dos conjuntos de</w:t>
-      </w:r>
-      <w:r>
-        <w:t xml:space="preserve"> </w:t>
-      </w:r>
-      <w:r>
-        <w:t xml:space="preserve">quantidades (</w:t>
-      </w:r>
-      <w:r>
-        <w:rPr>
-          <w:rStyle w:val="VerbatimChar"/>
-        </w:rPr>
-        <w:t xml:space="preserve">IfcElementQuantity</w:t>
-      </w:r>
-      <w:r>
-        <w:t xml:space="preserve"> </w:t>
-      </w:r>
-      <w:r>
-        <w:t xml:space="preserve">/</w:t>
-      </w:r>
-      <w:r>
-        <w:t xml:space="preserve"> </w:t>
-      </w:r>
-      <w:r>
-        <w:rPr>
-          <w:rStyle w:val="VerbatimChar"/>
-        </w:rPr>
-        <w:t xml:space="preserve">BaseQuantities</w:t>
-      </w:r>
-      <w:r>
-        <w:t xml:space="preserve">).</w:t>
-      </w:r>
-    </w:p>
-    <w:p>
-      <w:pPr>
-        <w:pStyle w:val="Compact"/>
-        <w:numPr>
-          <w:ilvl w:val="0"/>
-          <w:numId w:val="1003"/>
-        </w:numPr>
-      </w:pPr>
-      <w:r>
-        <w:rPr>
-          <w:b/>
-          <w:bCs/>
-        </w:rPr>
-        <w:t xml:space="preserve">Normalização de unidades</w:t>
-      </w:r>
-      <w:r>
-        <w:t xml:space="preserve">: comprimentos mm→m, áreas mm²→m², volumes mm³→m³,</w:t>
-      </w:r>
-      <w:r>
-        <w:t xml:space="preserve"> </w:t>
-      </w:r>
-      <w:r>
-        <w:t xml:space="preserve">com heurística por magnitude do valor.</w:t>
-      </w:r>
-    </w:p>
-    <w:p>
-      <w:pPr>
-        <w:pStyle w:val="Compact"/>
-        <w:numPr>
-          <w:ilvl w:val="0"/>
-          <w:numId w:val="1003"/>
-        </w:numPr>
-      </w:pPr>
-      <w:r>
-        <w:rPr>
-          <w:b/>
-          <w:bCs/>
-        </w:rPr>
-        <w:t xml:space="preserve">Deduplicação</w:t>
-      </w:r>
-      <w:r>
-        <w:t xml:space="preserve"> </w:t>
-      </w:r>
-      <w:r>
-        <w:t xml:space="preserve">de quantidades repetidas pelo exportador (mantém o valor</w:t>
-      </w:r>
-      <w:r>
-        <w:t xml:space="preserve"> </w:t>
-      </w:r>
-      <w:r>
-        <w:t xml:space="preserve">líquido / mínimo coerente).</w:t>
-      </w:r>
-    </w:p>
-    <w:p>
-      <w:pPr>
-        <w:pStyle w:val="Compact"/>
-        <w:numPr>
-          <w:ilvl w:val="0"/>
-          <w:numId w:val="1003"/>
-        </w:numPr>
-      </w:pPr>
-      <w:r>
-        <w:rPr>
-          <w:b/>
-          <w:bCs/>
-        </w:rPr>
-        <w:t xml:space="preserve">Fallback geométrico</w:t>
-      </w:r>
-      <w:r>
-        <w:t xml:space="preserve">: quando um elemento não tem</w:t>
-      </w:r>
-      <w:r>
-        <w:t xml:space="preserve"> </w:t>
-      </w:r>
-      <w:r>
-        <w:rPr>
-          <w:rStyle w:val="VerbatimChar"/>
-        </w:rPr>
-        <w:t xml:space="preserve">BaseQuantities</w:t>
-      </w:r>
-      <w:r>
-        <w:t xml:space="preserve">, tenta</w:t>
-      </w:r>
-      <w:r>
-        <w:t xml:space="preserve"> </w:t>
-      </w:r>
-      <w:r>
-        <w:t xml:space="preserve">derivar a quantidade a partir da geometria (ex.:</w:t>
-      </w:r>
-      <w:r>
-        <w:t xml:space="preserve"> </w:t>
-      </w:r>
-      <w:r>
-        <w:rPr>
-          <w:rStyle w:val="VerbatimChar"/>
-        </w:rPr>
-        <w:t xml:space="preserve">IfcExtrudedAreaSolid</w:t>
-      </w:r>
-      <w:r>
-        <w:t xml:space="preserve"> </w:t>
-      </w:r>
-      <w:r>
-        <w:t xml:space="preserve">+</w:t>
-      </w:r>
-      <w:r>
-        <w:t xml:space="preserve"> </w:t>
-      </w:r>
-      <w:r>
-        <w:rPr>
-          <w:rStyle w:val="VerbatimChar"/>
-        </w:rPr>
-        <w:t xml:space="preserve">IfcRectangleProfileDef</w:t>
-      </w:r>
-      <w:r>
-        <w:t xml:space="preserve">).</w:t>
-      </w:r>
-    </w:p>
-    <w:bookmarkEnd w:id="14"/>
-    <w:bookmarkStart w:id="15" w:name="regras-de-orçamento-libbudget.ts"/>
-    <w:p>
-      <w:pPr>
-        <w:pStyle w:val="Heading2"/>
-      </w:pPr>
-      <w:r>
-        <w:t xml:space="preserve">6. Regras de orçamento (</w:t>
-      </w:r>
-      <w:r>
-        <w:rPr>
-          <w:rStyle w:val="VerbatimChar"/>
-        </w:rPr>
-        <w:t xml:space="preserve">lib/budget.ts</w:t>
-      </w:r>
-      <w:r>
-        <w:t xml:space="preserve">)</w:t>
-      </w:r>
-    </w:p>
-    <w:p>
-      <w:pPr>
-        <w:pStyle w:val="FirstParagraph"/>
-      </w:pPr>
-      <w:r>
-        <w:t xml:space="preserve">Os elementos IFC são convertidos em itens agrupados por etapa. Resumo:</w:t>
+        <w:t xml:space="preserve">O projeto foi desenvolvido com o apoio de</w:t>
+      </w:r>
+      <w:r>
+        <w:t xml:space="preserve"> </w:t>
+      </w:r>
+      <w:r>
+        <w:rPr>
+          <w:b/>
+          <w:bCs/>
+        </w:rPr>
+        <w:t xml:space="preserve">agentes de IA especializados</w:t>
+      </w:r>
+      <w:r>
+        <w:t xml:space="preserve">,</w:t>
+      </w:r>
+      <w:r>
+        <w:t xml:space="preserve"> </w:t>
+      </w:r>
+      <w:r>
+        <w:t xml:space="preserve">cada um responsável por uma frente do trabalho, simulando um time de software</w:t>
+      </w:r>
+      <w:r>
+        <w:t xml:space="preserve"> </w:t>
+      </w:r>
+      <w:r>
+        <w:t xml:space="preserve">multidisciplinar:</w:t>
       </w:r>
     </w:p>
     <w:tbl>
@@ -1153,6 +713,744 @@
               <w:pStyle w:val="Compact"/>
             </w:pPr>
             <w:r>
+              <w:t xml:space="preserve">Agente</w:t>
+            </w:r>
+          </w:p>
+        </w:tc>
+        <w:tc>
+          <w:tcPr/>
+          <w:p>
+            <w:pPr>
+              <w:pStyle w:val="Compact"/>
+            </w:pPr>
+            <w:r>
+              <w:t xml:space="preserve">Papel</w:t>
+            </w:r>
+          </w:p>
+        </w:tc>
+        <w:tc>
+          <w:tcPr/>
+          <w:p>
+            <w:pPr>
+              <w:pStyle w:val="Compact"/>
+            </w:pPr>
+            <w:r>
+              <w:t xml:space="preserve">Responsabilidades</w:t>
+            </w:r>
+          </w:p>
+        </w:tc>
+      </w:tr>
+      <w:tr>
+        <w:tc>
+          <w:tcPr/>
+          <w:p>
+            <w:pPr>
+              <w:pStyle w:val="Compact"/>
+            </w:pPr>
+            <w:r>
+              <w:rPr>
+                <w:b/>
+                <w:bCs/>
+              </w:rPr>
+              <w:t xml:space="preserve">Agente de Backend</w:t>
+            </w:r>
+          </w:p>
+        </w:tc>
+        <w:tc>
+          <w:tcPr/>
+          <w:p>
+            <w:pPr>
+              <w:pStyle w:val="Compact"/>
+            </w:pPr>
+            <w:r>
+              <w:t xml:space="preserve">Desenvolvimento server-side</w:t>
+            </w:r>
+          </w:p>
+        </w:tc>
+        <w:tc>
+          <w:tcPr/>
+          <w:p>
+            <w:pPr>
+              <w:pStyle w:val="Compact"/>
+            </w:pPr>
+            <w:r>
+              <w:t xml:space="preserve">Parser do IFC, endpoints da API (</w:t>
+            </w:r>
+            <w:r>
+              <w:rPr>
+                <w:rStyle w:val="VerbatimChar"/>
+              </w:rPr>
+              <w:t xml:space="preserve">/api/ifc</w:t>
+            </w:r>
+            <w:r>
+              <w:t xml:space="preserve">,</w:t>
+            </w:r>
+            <w:r>
+              <w:t xml:space="preserve"> </w:t>
+            </w:r>
+            <w:r>
+              <w:rPr>
+                <w:rStyle w:val="VerbatimChar"/>
+              </w:rPr>
+              <w:t xml:space="preserve">/api/ifc/export</w:t>
+            </w:r>
+            <w:r>
+              <w:t xml:space="preserve">), normalização de unidades e geração da planilha.</w:t>
+            </w:r>
+          </w:p>
+        </w:tc>
+      </w:tr>
+      <w:tr>
+        <w:tc>
+          <w:tcPr/>
+          <w:p>
+            <w:pPr>
+              <w:pStyle w:val="Compact"/>
+            </w:pPr>
+            <w:r>
+              <w:rPr>
+                <w:b/>
+                <w:bCs/>
+              </w:rPr>
+              <w:t xml:space="preserve">Agente de Frontend</w:t>
+            </w:r>
+          </w:p>
+        </w:tc>
+        <w:tc>
+          <w:tcPr/>
+          <w:p>
+            <w:pPr>
+              <w:pStyle w:val="Compact"/>
+            </w:pPr>
+            <w:r>
+              <w:t xml:space="preserve">Interface e experiência</w:t>
+            </w:r>
+          </w:p>
+        </w:tc>
+        <w:tc>
+          <w:tcPr/>
+          <w:p>
+            <w:pPr>
+              <w:pStyle w:val="Compact"/>
+            </w:pPr>
+            <w:r>
+              <w:t xml:space="preserve">UI em Next.js/Tailwind, visualizador 3D, tabela editável, fonte de custos e identidade visual.</w:t>
+            </w:r>
+          </w:p>
+        </w:tc>
+      </w:tr>
+      <w:tr>
+        <w:tc>
+          <w:tcPr/>
+          <w:p>
+            <w:pPr>
+              <w:pStyle w:val="Compact"/>
+            </w:pPr>
+            <w:r>
+              <w:rPr>
+                <w:b/>
+                <w:bCs/>
+              </w:rPr>
+              <w:t xml:space="preserve">Agente de QA</w:t>
+            </w:r>
+          </w:p>
+        </w:tc>
+        <w:tc>
+          <w:tcPr/>
+          <w:p>
+            <w:pPr>
+              <w:pStyle w:val="Compact"/>
+            </w:pPr>
+            <w:r>
+              <w:t xml:space="preserve">Qualidade e validação</w:t>
+            </w:r>
+          </w:p>
+        </w:tc>
+        <w:tc>
+          <w:tcPr/>
+          <w:p>
+            <w:pPr>
+              <w:pStyle w:val="Compact"/>
+            </w:pPr>
+            <w:r>
+              <w:t xml:space="preserve">Verificação de tipos, testes com o modelo de referência, conferência de quantidades/unidades e revisão de regressões.</w:t>
+            </w:r>
+          </w:p>
+        </w:tc>
+      </w:tr>
+      <w:tr>
+        <w:tc>
+          <w:tcPr/>
+          <w:p>
+            <w:pPr>
+              <w:pStyle w:val="Compact"/>
+            </w:pPr>
+            <w:r>
+              <w:rPr>
+                <w:b/>
+                <w:bCs/>
+              </w:rPr>
+              <w:t xml:space="preserve">Agente Orçamentista</w:t>
+            </w:r>
+          </w:p>
+        </w:tc>
+        <w:tc>
+          <w:tcPr/>
+          <w:p>
+            <w:pPr>
+              <w:pStyle w:val="Compact"/>
+            </w:pPr>
+            <w:r>
+              <w:t xml:space="preserve">Domínio de orçamento</w:t>
+            </w:r>
+          </w:p>
+        </w:tc>
+        <w:tc>
+          <w:tcPr/>
+          <w:p>
+            <w:pPr>
+              <w:pStyle w:val="Compact"/>
+            </w:pPr>
+            <w:r>
+              <w:t xml:space="preserve">Tradução dos elementos IFC em itens de serviço, critérios de engenharia (faces de parede, cobertura, estimativas) e mapeamento de preços SINAPI com unidades compatíveis.</w:t>
+            </w:r>
+          </w:p>
+        </w:tc>
+      </w:tr>
+    </w:tbl>
+    <w:p>
+      <w:pPr>
+        <w:pStyle w:val="BodyText"/>
+      </w:pPr>
+      <w:r>
+        <w:t xml:space="preserve">Essa divisão por papéis permitiu separar claramente as preocupações técnicas</w:t>
+      </w:r>
+      <w:r>
+        <w:t xml:space="preserve"> </w:t>
+      </w:r>
+      <w:r>
+        <w:t xml:space="preserve">(backend, frontend, QA) da regra de negócio de orçamentação, conduzida pelo</w:t>
+      </w:r>
+      <w:r>
+        <w:t xml:space="preserve"> </w:t>
+      </w:r>
+      <w:r>
+        <w:rPr>
+          <w:b/>
+          <w:bCs/>
+        </w:rPr>
+        <w:t xml:space="preserve">agente orçamentista</w:t>
+      </w:r>
+      <w:r>
+        <w:t xml:space="preserve">, que define como o modelo BIM se traduz em custos.</w:t>
+      </w:r>
+    </w:p>
+    <w:bookmarkEnd w:id="13"/>
+    <w:bookmarkStart w:id="14" w:name="fluxo-de-dados"/>
+    <w:p>
+      <w:pPr>
+        <w:pStyle w:val="Heading2"/>
+      </w:pPr>
+      <w:r>
+        <w:t xml:space="preserve">5. Fluxo de dados</w:t>
+      </w:r>
+    </w:p>
+    <w:p>
+      <w:pPr>
+        <w:pStyle w:val="Compact"/>
+        <w:numPr>
+          <w:ilvl w:val="0"/>
+          <w:numId w:val="1002"/>
+        </w:numPr>
+      </w:pPr>
+      <w:r>
+        <w:rPr>
+          <w:b/>
+          <w:bCs/>
+        </w:rPr>
+        <w:t xml:space="preserve">Upload</w:t>
+      </w:r>
+      <w:r>
+        <w:t xml:space="preserve"> </w:t>
+      </w:r>
+      <w:r>
+        <w:t xml:space="preserve">— o usuário seleciona um</w:t>
+      </w:r>
+      <w:r>
+        <w:t xml:space="preserve"> </w:t>
+      </w:r>
+      <w:r>
+        <w:rPr>
+          <w:rStyle w:val="VerbatimChar"/>
+        </w:rPr>
+        <w:t xml:space="preserve">.ifc</w:t>
+      </w:r>
+      <w:r>
+        <w:t xml:space="preserve"> </w:t>
+      </w:r>
+      <w:r>
+        <w:t xml:space="preserve">na interface.</w:t>
+      </w:r>
+    </w:p>
+    <w:p>
+      <w:pPr>
+        <w:pStyle w:val="Compact"/>
+        <w:numPr>
+          <w:ilvl w:val="0"/>
+          <w:numId w:val="1002"/>
+        </w:numPr>
+      </w:pPr>
+      <w:r>
+        <w:rPr>
+          <w:b/>
+          <w:bCs/>
+        </w:rPr>
+        <w:t xml:space="preserve">Parse</w:t>
+      </w:r>
+      <w:r>
+        <w:t xml:space="preserve"> </w:t>
+      </w:r>
+      <w:r>
+        <w:t xml:space="preserve">(</w:t>
+      </w:r>
+      <w:r>
+        <w:rPr>
+          <w:rStyle w:val="VerbatimChar"/>
+        </w:rPr>
+        <w:t xml:space="preserve">POST /api/ifc</w:t>
+      </w:r>
+      <w:r>
+        <w:t xml:space="preserve">) — o arquivo é lido pelo parser STEP, que extrai os</w:t>
+      </w:r>
+      <w:r>
+        <w:t xml:space="preserve"> </w:t>
+      </w:r>
+      <w:r>
+        <w:t xml:space="preserve">elementos (paredes, lajes, pilares, vigas, fundações, portas, janelas,</w:t>
+      </w:r>
+      <w:r>
+        <w:t xml:space="preserve"> </w:t>
+      </w:r>
+      <w:r>
+        <w:t xml:space="preserve">coberturas) e suas quantidades.</w:t>
+      </w:r>
+    </w:p>
+    <w:p>
+      <w:pPr>
+        <w:pStyle w:val="Compact"/>
+        <w:numPr>
+          <w:ilvl w:val="0"/>
+          <w:numId w:val="1002"/>
+        </w:numPr>
+      </w:pPr>
+      <w:r>
+        <w:rPr>
+          <w:b/>
+          <w:bCs/>
+        </w:rPr>
+        <w:t xml:space="preserve">Orçamentação</w:t>
+      </w:r>
+      <w:r>
+        <w:t xml:space="preserve"> </w:t>
+      </w:r>
+      <w:r>
+        <w:t xml:space="preserve">(</w:t>
+      </w:r>
+      <w:r>
+        <w:rPr>
+          <w:rStyle w:val="VerbatimChar"/>
+        </w:rPr>
+        <w:t xml:space="preserve">lib/budget.ts</w:t>
+      </w:r>
+      <w:r>
+        <w:t xml:space="preserve">) — os elementos viram itens de serviço</w:t>
+      </w:r>
+      <w:r>
+        <w:t xml:space="preserve"> </w:t>
+      </w:r>
+      <w:r>
+        <w:t xml:space="preserve">agrupados por etapa, com unidade e quantidade.</w:t>
+      </w:r>
+    </w:p>
+    <w:p>
+      <w:pPr>
+        <w:pStyle w:val="Compact"/>
+        <w:numPr>
+          <w:ilvl w:val="0"/>
+          <w:numId w:val="1002"/>
+        </w:numPr>
+      </w:pPr>
+      <w:r>
+        <w:rPr>
+          <w:b/>
+          <w:bCs/>
+        </w:rPr>
+        <w:t xml:space="preserve">Precificação</w:t>
+      </w:r>
+      <w:r>
+        <w:t xml:space="preserve"> </w:t>
+      </w:r>
+      <w:r>
+        <w:t xml:space="preserve">(</w:t>
+      </w:r>
+      <w:r>
+        <w:rPr>
+          <w:rStyle w:val="VerbatimChar"/>
+        </w:rPr>
+        <w:t xml:space="preserve">lib/sinapi.ts</w:t>
+      </w:r>
+      <w:r>
+        <w:t xml:space="preserve">) — cada item recebe um preço unitário de</w:t>
+      </w:r>
+      <w:r>
+        <w:t xml:space="preserve"> </w:t>
+      </w:r>
+      <w:r>
+        <w:t xml:space="preserve">referência SINAPI (ou inserido pelo usuário).</w:t>
+      </w:r>
+    </w:p>
+    <w:p>
+      <w:pPr>
+        <w:pStyle w:val="Compact"/>
+        <w:numPr>
+          <w:ilvl w:val="0"/>
+          <w:numId w:val="1002"/>
+        </w:numPr>
+      </w:pPr>
+      <w:r>
+        <w:rPr>
+          <w:b/>
+          <w:bCs/>
+        </w:rPr>
+        <w:t xml:space="preserve">Visualização</w:t>
+      </w:r>
+      <w:r>
+        <w:t xml:space="preserve"> </w:t>
+      </w:r>
+      <w:r>
+        <w:t xml:space="preserve">— a tabela é exibida na web; o modelo aparece em 3D.</w:t>
+      </w:r>
+    </w:p>
+    <w:p>
+      <w:pPr>
+        <w:pStyle w:val="Compact"/>
+        <w:numPr>
+          <w:ilvl w:val="0"/>
+          <w:numId w:val="1002"/>
+        </w:numPr>
+      </w:pPr>
+      <w:r>
+        <w:rPr>
+          <w:b/>
+          <w:bCs/>
+        </w:rPr>
+        <w:t xml:space="preserve">Exportação</w:t>
+      </w:r>
+      <w:r>
+        <w:t xml:space="preserve"> </w:t>
+      </w:r>
+      <w:r>
+        <w:t xml:space="preserve">(</w:t>
+      </w:r>
+      <w:r>
+        <w:rPr>
+          <w:rStyle w:val="VerbatimChar"/>
+        </w:rPr>
+        <w:t xml:space="preserve">POST /api/ifc/export</w:t>
+      </w:r>
+      <w:r>
+        <w:t xml:space="preserve">) — gera o</w:t>
+      </w:r>
+      <w:r>
+        <w:t xml:space="preserve"> </w:t>
+      </w:r>
+      <w:r>
+        <w:rPr>
+          <w:rStyle w:val="VerbatimChar"/>
+        </w:rPr>
+        <w:t xml:space="preserve">.xlsx</w:t>
+      </w:r>
+      <w:r>
+        <w:t xml:space="preserve"> </w:t>
+      </w:r>
+      <w:r>
+        <w:t xml:space="preserve">com os preços efetivos.</w:t>
+      </w:r>
+    </w:p>
+    <w:bookmarkEnd w:id="14"/>
+    <w:bookmarkStart w:id="15" w:name="parser-ifc-libifc.ts"/>
+    <w:p>
+      <w:pPr>
+        <w:pStyle w:val="Heading2"/>
+      </w:pPr>
+      <w:r>
+        <w:t xml:space="preserve">6. Parser IFC (</w:t>
+      </w:r>
+      <w:r>
+        <w:rPr>
+          <w:rStyle w:val="VerbatimChar"/>
+        </w:rPr>
+        <w:t xml:space="preserve">lib/ifc.ts</w:t>
+      </w:r>
+      <w:r>
+        <w:t xml:space="preserve">)</w:t>
+      </w:r>
+    </w:p>
+    <w:p>
+      <w:pPr>
+        <w:pStyle w:val="FirstParagraph"/>
+      </w:pPr>
+      <w:r>
+        <w:t xml:space="preserve">O IFC segue o padrão</w:t>
+      </w:r>
+      <w:r>
+        <w:t xml:space="preserve"> </w:t>
+      </w:r>
+      <w:r>
+        <w:rPr>
+          <w:b/>
+          <w:bCs/>
+        </w:rPr>
+        <w:t xml:space="preserve">STEP / ISO-10303-21</w:t>
+      </w:r>
+      <w:r>
+        <w:t xml:space="preserve">. O parser implementado é leve e não</w:t>
+      </w:r>
+      <w:r>
+        <w:t xml:space="preserve"> </w:t>
+      </w:r>
+      <w:r>
+        <w:t xml:space="preserve">usa WASM. Principais responsabilidades:</w:t>
+      </w:r>
+    </w:p>
+    <w:p>
+      <w:pPr>
+        <w:pStyle w:val="Compact"/>
+        <w:numPr>
+          <w:ilvl w:val="0"/>
+          <w:numId w:val="1003"/>
+        </w:numPr>
+      </w:pPr>
+      <w:r>
+        <w:rPr>
+          <w:b/>
+          <w:bCs/>
+        </w:rPr>
+        <w:t xml:space="preserve">Leitura das entidades</w:t>
+      </w:r>
+      <w:r>
+        <w:t xml:space="preserve"> </w:t>
+      </w:r>
+      <w:r>
+        <w:t xml:space="preserve">(</w:t>
+      </w:r>
+      <w:r>
+        <w:rPr>
+          <w:rStyle w:val="VerbatimChar"/>
+        </w:rPr>
+        <w:t xml:space="preserve">#id = IFCTIPO(args)</w:t>
+      </w:r>
+      <w:r>
+        <w:t xml:space="preserve">) e dos conjuntos de</w:t>
+      </w:r>
+      <w:r>
+        <w:t xml:space="preserve"> </w:t>
+      </w:r>
+      <w:r>
+        <w:t xml:space="preserve">quantidades (</w:t>
+      </w:r>
+      <w:r>
+        <w:rPr>
+          <w:rStyle w:val="VerbatimChar"/>
+        </w:rPr>
+        <w:t xml:space="preserve">IfcElementQuantity</w:t>
+      </w:r>
+      <w:r>
+        <w:t xml:space="preserve"> </w:t>
+      </w:r>
+      <w:r>
+        <w:t xml:space="preserve">/</w:t>
+      </w:r>
+      <w:r>
+        <w:t xml:space="preserve"> </w:t>
+      </w:r>
+      <w:r>
+        <w:rPr>
+          <w:rStyle w:val="VerbatimChar"/>
+        </w:rPr>
+        <w:t xml:space="preserve">BaseQuantities</w:t>
+      </w:r>
+      <w:r>
+        <w:t xml:space="preserve">).</w:t>
+      </w:r>
+    </w:p>
+    <w:p>
+      <w:pPr>
+        <w:pStyle w:val="Compact"/>
+        <w:numPr>
+          <w:ilvl w:val="0"/>
+          <w:numId w:val="1003"/>
+        </w:numPr>
+      </w:pPr>
+      <w:r>
+        <w:rPr>
+          <w:b/>
+          <w:bCs/>
+        </w:rPr>
+        <w:t xml:space="preserve">Normalização de unidades</w:t>
+      </w:r>
+      <w:r>
+        <w:t xml:space="preserve">: comprimentos mm→m, áreas mm²→m², volumes mm³→m³,</w:t>
+      </w:r>
+      <w:r>
+        <w:t xml:space="preserve"> </w:t>
+      </w:r>
+      <w:r>
+        <w:t xml:space="preserve">com heurística por magnitude do valor.</w:t>
+      </w:r>
+    </w:p>
+    <w:p>
+      <w:pPr>
+        <w:pStyle w:val="Compact"/>
+        <w:numPr>
+          <w:ilvl w:val="0"/>
+          <w:numId w:val="1003"/>
+        </w:numPr>
+      </w:pPr>
+      <w:r>
+        <w:rPr>
+          <w:b/>
+          <w:bCs/>
+        </w:rPr>
+        <w:t xml:space="preserve">Deduplicação</w:t>
+      </w:r>
+      <w:r>
+        <w:t xml:space="preserve"> </w:t>
+      </w:r>
+      <w:r>
+        <w:t xml:space="preserve">de quantidades repetidas pelo exportador (mantém o valor</w:t>
+      </w:r>
+      <w:r>
+        <w:t xml:space="preserve"> </w:t>
+      </w:r>
+      <w:r>
+        <w:t xml:space="preserve">líquido / mínimo coerente).</w:t>
+      </w:r>
+    </w:p>
+    <w:p>
+      <w:pPr>
+        <w:pStyle w:val="Compact"/>
+        <w:numPr>
+          <w:ilvl w:val="0"/>
+          <w:numId w:val="1003"/>
+        </w:numPr>
+      </w:pPr>
+      <w:r>
+        <w:rPr>
+          <w:b/>
+          <w:bCs/>
+        </w:rPr>
+        <w:t xml:space="preserve">Fallback geométrico</w:t>
+      </w:r>
+      <w:r>
+        <w:t xml:space="preserve">: quando um elemento não tem</w:t>
+      </w:r>
+      <w:r>
+        <w:t xml:space="preserve"> </w:t>
+      </w:r>
+      <w:r>
+        <w:rPr>
+          <w:rStyle w:val="VerbatimChar"/>
+        </w:rPr>
+        <w:t xml:space="preserve">BaseQuantities</w:t>
+      </w:r>
+      <w:r>
+        <w:t xml:space="preserve">, tenta</w:t>
+      </w:r>
+      <w:r>
+        <w:t xml:space="preserve"> </w:t>
+      </w:r>
+      <w:r>
+        <w:t xml:space="preserve">derivar a quantidade a partir da geometria (ex.:</w:t>
+      </w:r>
+      <w:r>
+        <w:t xml:space="preserve"> </w:t>
+      </w:r>
+      <w:r>
+        <w:rPr>
+          <w:rStyle w:val="VerbatimChar"/>
+        </w:rPr>
+        <w:t xml:space="preserve">IfcExtrudedAreaSolid</w:t>
+      </w:r>
+      <w:r>
+        <w:t xml:space="preserve"> </w:t>
+      </w:r>
+      <w:r>
+        <w:t xml:space="preserve">+</w:t>
+      </w:r>
+      <w:r>
+        <w:t xml:space="preserve"> </w:t>
+      </w:r>
+      <w:r>
+        <w:rPr>
+          <w:rStyle w:val="VerbatimChar"/>
+        </w:rPr>
+        <w:t xml:space="preserve">IfcRectangleProfileDef</w:t>
+      </w:r>
+      <w:r>
+        <w:t xml:space="preserve">).</w:t>
+      </w:r>
+    </w:p>
+    <w:bookmarkEnd w:id="15"/>
+    <w:bookmarkStart w:id="16" w:name="regras-de-orçamento-libbudget.ts"/>
+    <w:p>
+      <w:pPr>
+        <w:pStyle w:val="Heading2"/>
+      </w:pPr>
+      <w:r>
+        <w:t xml:space="preserve">7. Regras de orçamento (</w:t>
+      </w:r>
+      <w:r>
+        <w:rPr>
+          <w:rStyle w:val="VerbatimChar"/>
+        </w:rPr>
+        <w:t xml:space="preserve">lib/budget.ts</w:t>
+      </w:r>
+      <w:r>
+        <w:t xml:space="preserve">)</w:t>
+      </w:r>
+    </w:p>
+    <w:p>
+      <w:pPr>
+        <w:pStyle w:val="FirstParagraph"/>
+      </w:pPr>
+      <w:r>
+        <w:t xml:space="preserve">Os elementos IFC são convertidos em itens agrupados por etapa. Resumo:</w:t>
+      </w:r>
+    </w:p>
+    <w:tbl>
+      <w:tblPr>
+        <w:tblStyle w:val="Table"/>
+        <w:tblW w:type="pct" w:w="5000"/>
+        <w:tblLayout w:type="fixed"/>
+        <w:tblLook w:firstRow="1" w:lastRow="0" w:firstColumn="0" w:lastColumn="0" w:noHBand="0" w:noVBand="0" w:val="0020"/>
+      </w:tblPr>
+      <w:tblGrid>
+        <w:gridCol w:w="2640"/>
+        <w:gridCol w:w="2640"/>
+        <w:gridCol w:w="2640"/>
+      </w:tblGrid>
+      <w:tr>
+        <w:trPr>
+          <w:tblHeader w:val="on"/>
+        </w:trPr>
+        <w:tc>
+          <w:tcPr/>
+          <w:p>
+            <w:pPr>
+              <w:pStyle w:val="Compact"/>
+            </w:pPr>
+            <w:r>
               <w:t xml:space="preserve">Etapa</w:t>
             </w:r>
           </w:p>
@@ -1632,14 +1930,14 @@
         <w:t xml:space="preserve">~10 m² de fôrma por m³ de concreto, ~100 kg/m³ de armadura).</w:t>
       </w:r>
     </w:p>
-    <w:bookmarkEnd w:id="15"/>
-    <w:bookmarkStart w:id="16" w:name="precificação-sinapi-libsinapi.ts"/>
+    <w:bookmarkEnd w:id="16"/>
+    <w:bookmarkStart w:id="17" w:name="precificação-sinapi-libsinapi.ts"/>
     <w:p>
       <w:pPr>
         <w:pStyle w:val="Heading2"/>
       </w:pPr>
       <w:r>
-        <w:t xml:space="preserve">7. Precificação SINAPI (</w:t>
+        <w:t xml:space="preserve">8. Precificação SINAPI (</w:t>
       </w:r>
       <w:r>
         <w:rPr>
@@ -1892,14 +2190,14 @@
         <w:t xml:space="preserve">https://www.caixa.gov.br/site/Paginas/downloads.aspx</w:t>
       </w:r>
     </w:p>
-    <w:bookmarkEnd w:id="16"/>
-    <w:bookmarkStart w:id="17" w:name="exportação-excel-libifcxlsx.ts"/>
+    <w:bookmarkEnd w:id="17"/>
+    <w:bookmarkStart w:id="18" w:name="exportação-excel-libifcxlsx.ts"/>
     <w:p>
       <w:pPr>
         <w:pStyle w:val="Heading2"/>
       </w:pPr>
       <w:r>
-        <w:t xml:space="preserve">8. Exportação Excel (</w:t>
+        <w:t xml:space="preserve">9. Exportação Excel (</w:t>
       </w:r>
       <w:r>
         <w:rPr>
@@ -2000,14 +2298,14 @@
         <w:t xml:space="preserve">— lista por elemento (tipo, nome, GUID, área, comprimento, volume).</w:t>
       </w:r>
     </w:p>
-    <w:bookmarkEnd w:id="17"/>
-    <w:bookmarkStart w:id="18" w:name="visualizador-3d"/>
+    <w:bookmarkEnd w:id="18"/>
+    <w:bookmarkStart w:id="19" w:name="visualizador-3d"/>
     <w:p>
       <w:pPr>
         <w:pStyle w:val="Heading2"/>
       </w:pPr>
       <w:r>
-        <w:t xml:space="preserve">9. Visualizador 3D</w:t>
+        <w:t xml:space="preserve">10. Visualizador 3D</w:t>
       </w:r>
     </w:p>
     <w:p>
@@ -2053,14 +2351,14 @@
         <w:t xml:space="preserve">facilitando a conferência visual do takeoff.</w:t>
       </w:r>
     </w:p>
-    <w:bookmarkEnd w:id="18"/>
-    <w:bookmarkStart w:id="20" w:name="como-executar"/>
+    <w:bookmarkEnd w:id="19"/>
+    <w:bookmarkStart w:id="21" w:name="como-executar"/>
     <w:p>
       <w:pPr>
         <w:pStyle w:val="Heading2"/>
       </w:pPr>
       <w:r>
-        <w:t xml:space="preserve">10. Como executar</w:t>
+        <w:t xml:space="preserve">11. Como executar</w:t>
       </w:r>
     </w:p>
     <w:p>
@@ -2109,7 +2407,7 @@
         <w:t xml:space="preserve">Requer Node.js 18+ (testado com Node 24).</w:t>
       </w:r>
     </w:p>
-    <w:bookmarkStart w:id="19" w:name="uso"/>
+    <w:bookmarkStart w:id="20" w:name="uso"/>
     <w:p>
       <w:pPr>
         <w:pStyle w:val="Heading3"/>
@@ -2235,15 +2533,15 @@
         <w:t xml:space="preserve">.</w:t>
       </w:r>
     </w:p>
-    <w:bookmarkEnd w:id="19"/>
     <w:bookmarkEnd w:id="20"/>
-    <w:bookmarkStart w:id="21" w:name="validação"/>
+    <w:bookmarkEnd w:id="21"/>
+    <w:bookmarkStart w:id="22" w:name="validação"/>
     <w:p>
       <w:pPr>
         <w:pStyle w:val="Heading2"/>
       </w:pPr>
       <w:r>
-        <w:t xml:space="preserve">11. Validação</w:t>
+        <w:t xml:space="preserve">12. Validação</w:t>
       </w:r>
     </w:p>
     <w:p>
@@ -2282,14 +2580,14 @@
         <w:t xml:space="preserve">de unidades entre o app e a referência SINAPI.</w:t>
       </w:r>
     </w:p>
-    <w:bookmarkEnd w:id="21"/>
-    <w:bookmarkStart w:id="22" w:name="limitações-e-próximos-passos"/>
+    <w:bookmarkEnd w:id="22"/>
+    <w:bookmarkStart w:id="23" w:name="limitações-e-próximos-passos"/>
     <w:p>
       <w:pPr>
         <w:pStyle w:val="Heading2"/>
       </w:pPr>
       <w:r>
-        <w:t xml:space="preserve">12. Limitações e próximos passos</w:t>
+        <w:t xml:space="preserve">13. Limitações e próximos passos</w:t>
       </w:r>
     </w:p>
     <w:p>
@@ -2409,8 +2707,8 @@
         <w:t xml:space="preserve">Possível adicionar BDI, encargos e composição detalhada de preços.</w:t>
       </w:r>
     </w:p>
-    <w:bookmarkEnd w:id="22"/>
     <w:bookmarkEnd w:id="23"/>
+    <w:bookmarkEnd w:id="24"/>
     <w:sectPr>
       <w:footnotePr>
         <w:numRestart w:val="eachSect"/>

</xml_diff>